<commit_message>
Regenerate Results docx with real values only (previous render held layout-test numbers)
</commit_message>
<xml_diff>
--- a/report/results_section.docx
+++ b/report/results_section.docx
@@ -98,7 +98,7 @@
       </w:r>
       <w:r>
         <w:rPr/>
-        <w:t>1,149</w:t>
+        <w:t>1,242</w:t>
       </w:r>
       <w:r>
         <w:rPr/>
@@ -106,7 +106,7 @@
       </w:r>
       <w:r>
         <w:rPr/>
-        <w:t>345</w:t>
+        <w:t>355</w:t>
       </w:r>
       <w:r>
         <w:rPr/>
@@ -114,7 +114,7 @@
       </w:r>
       <w:r>
         <w:rPr/>
-        <w:t>526</w:t>
+        <w:t>536</w:t>
       </w:r>
       <w:r>
         <w:rPr/>
@@ -122,7 +122,7 @@
       </w:r>
       <w:r>
         <w:rPr/>
-        <w:t>278</w:t>
+        <w:t>275</w:t>
       </w:r>
       <w:r>
         <w:rPr/>
@@ -130,7 +130,7 @@
       </w:r>
       <w:r>
         <w:rPr/>
-        <w:t>627</w:t>
+        <w:t>652</w:t>
       </w:r>
       <w:r>
         <w:rPr/>
@@ -289,7 +289,7 @@
               <w:rPr>
                 <w:sz w:val="18"/>
               </w:rPr>
-              <w:t>351</w:t>
+              <w:t>364</w:t>
             </w:r>
           </w:p>
         </w:tc>
@@ -307,7 +307,7 @@
               <w:rPr>
                 <w:sz w:val="18"/>
               </w:rPr>
-              <w:t>163</w:t>
+              <w:t>179</w:t>
             </w:r>
           </w:p>
         </w:tc>
@@ -348,7 +348,7 @@
               <w:rPr>
                 <w:sz w:val="18"/>
               </w:rPr>
-              <w:t>27</w:t>
+              <w:t>50</w:t>
             </w:r>
           </w:p>
         </w:tc>
@@ -366,7 +366,7 @@
               <w:rPr>
                 <w:sz w:val="18"/>
               </w:rPr>
-              <w:t>27</w:t>
+              <w:t>50</w:t>
             </w:r>
           </w:p>
         </w:tc>
@@ -407,7 +407,7 @@
               <w:rPr>
                 <w:sz w:val="18"/>
               </w:rPr>
-              <w:t>0.071</w:t>
+              <w:t>0.121</w:t>
             </w:r>
           </w:p>
         </w:tc>
@@ -425,7 +425,7 @@
               <w:rPr>
                 <w:sz w:val="18"/>
               </w:rPr>
-              <w:t>0.142</w:t>
+              <w:t>0.218</w:t>
             </w:r>
           </w:p>
         </w:tc>
@@ -466,7 +466,7 @@
               <w:rPr>
                 <w:sz w:val="18"/>
               </w:rPr>
-              <w:t>341</w:t>
+              <w:t>366</w:t>
             </w:r>
           </w:p>
         </w:tc>
@@ -484,7 +484,7 @@
               <w:rPr>
                 <w:sz w:val="18"/>
               </w:rPr>
-              <w:t>169</w:t>
+              <w:t>198</w:t>
             </w:r>
           </w:p>
         </w:tc>
@@ -531,7 +531,7 @@
               <w:rPr>
                 <w:sz w:val="18"/>
               </w:rPr>
-              <w:t>119</w:t>
+              <w:t>132</w:t>
             </w:r>
           </w:p>
         </w:tc>
@@ -593,7 +593,7 @@
               <w:rPr>
                 <w:sz w:val="18"/>
               </w:rPr>
-              <w:t>44,064</w:t>
+              <w:t>47,177</w:t>
             </w:r>
           </w:p>
         </w:tc>
@@ -629,7 +629,7 @@
       </w:r>
       <w:r>
         <w:rPr/>
-        <w:t>378</w:t>
+        <w:t>382</w:t>
       </w:r>
       <w:r>
         <w:rPr/>
@@ -637,7 +637,7 @@
       </w:r>
       <w:r>
         <w:rPr/>
-        <w:t>341</w:t>
+        <w:t>340</w:t>
       </w:r>
       <w:r>
         <w:rPr/>
@@ -645,7 +645,7 @@
       </w:r>
       <w:r>
         <w:rPr/>
-        <w:t>10</w:t>
+        <w:t>13</w:t>
       </w:r>
       <w:r>
         <w:rPr/>
@@ -653,61 +653,79 @@
       </w:r>
       <w:r>
         <w:rPr/>
-        <w:t>27</w:t>
+        <w:t>29</w:t>
       </w:r>
       <w:r>
         <w:rPr/>
-        <w:t xml:space="preserve"> unverified because they offer credit but match no directory entry. A further </w:t>
+        <w:t xml:space="preserve"> unverified because they offer credit but match no directory entry. The remaining </w:t>
       </w:r>
       <w:r>
         <w:rPr/>
-        <w:t>0</w:t>
+        <w:t>138</w:t>
       </w:r>
       <w:r>
         <w:rPr/>
-        <w:t xml:space="preserve"> came from the flagged-app seed list and </w:t>
+        <w:t xml:space="preserve"> apps (name matches in the review band, unlisted apps of listed lenders, and unclear lending status) were labelled manually following a written guide, giving </w:t>
       </w:r>
       <w:r>
         <w:rPr/>
-        <w:t>0</w:t>
+        <w:t>11</w:t>
       </w:r>
       <w:r>
         <w:rPr/>
-        <w:t xml:space="preserve"> from manual review. Two annotators independently labelled the </w:t>
+        <w:t xml:space="preserve"> verified, </w:t>
       </w:r>
       <w:r>
         <w:rPr/>
-        <w:t>130</w:t>
+        <w:t>21</w:t>
       </w:r>
       <w:r>
         <w:rPr/>
-        <w:t xml:space="preserve">-app review queue, with Cohen's κ = </w:t>
-      </w:r>
-      <w:r>
-        <w:rPr>
-          <w:i w:val="0"/>
-          <w:color w:val="C01F1F"/>
-        </w:rPr>
-        <w:t>[data.kappa]</w:t>
+        <w:t xml:space="preserve"> unverified and </w:t>
       </w:r>
       <w:r>
         <w:rPr/>
-        <w:t xml:space="preserve"> (</w:t>
-      </w:r>
-      <w:r>
-        <w:rPr>
-          <w:i w:val="0"/>
-          <w:color w:val="C01F1F"/>
-        </w:rPr>
-        <w:t>[data.agreement]</w:t>
+        <w:t>106</w:t>
       </w:r>
       <w:r>
         <w:rPr/>
-        <w:t xml:space="preserve"> raw agreement). Unverified apps are markedly newer: </w:t>
+        <w:t xml:space="preserve"> non-lending apps. This was done by a single AI-assisted annotator, so no inter-annotator agreement is available. An audit of 50 random automatic labels found </w:t>
       </w:r>
       <w:r>
         <w:rPr/>
-        <w:t>15</w:t>
+        <w:t>1</w:t>
+      </w:r>
+      <w:r>
+        <w:rPr/>
+        <w:t xml:space="preserve"> error (</w:t>
+      </w:r>
+      <w:r>
+        <w:rPr/>
+        <w:t>2% of 50</w:t>
+      </w:r>
+      <w:r>
+        <w:rPr/>
+        <w:t xml:space="preserve">), a listed bank app excluded by the lending-terms rule, and the rule was corrected. A seed list of </w:t>
+      </w:r>
+      <w:r>
+        <w:rPr/>
+        <w:t>46</w:t>
+      </w:r>
+      <w:r>
+        <w:rPr/>
+        <w:t xml:space="preserve"> app names from police and cyber-cell advisories added no training examples: </w:t>
+      </w:r>
+      <w:r>
+        <w:rPr/>
+        <w:t>38</w:t>
+      </w:r>
+      <w:r>
+        <w:rPr/>
+        <w:t xml:space="preserve"> are no longer on Google Play and the rest matched unrelated apps by name. Unverified apps are markedly newer: </w:t>
+      </w:r>
+      <w:r>
+        <w:rPr/>
+        <w:t>21</w:t>
       </w:r>
       <w:r>
         <w:rPr/>
@@ -715,7 +733,7 @@
       </w:r>
       <w:r>
         <w:rPr/>
-        <w:t>27</w:t>
+        <w:t>50</w:t>
       </w:r>
       <w:r>
         <w:rPr/>
@@ -759,16 +777,22 @@
         <w:t xml:space="preserve"> show their precision–recall curves and confusion matrices. The best tabular model was </w:t>
       </w:r>
       <w:r>
-        <w:rPr/>
-        <w:t>Random forest</w:t>
+        <w:rPr>
+          <w:i w:val="0"/>
+          <w:color w:val="C01F1F"/>
+        </w:rPr>
+        <w:t>[main.best_tabular]</w:t>
       </w:r>
       <w:r>
         <w:rPr/>
         <w:t xml:space="preserve"> and the best text model </w:t>
       </w:r>
       <w:r>
-        <w:rPr/>
-        <w:t>TF-IDF + SVM</w:t>
+        <w:rPr>
+          <w:i w:val="0"/>
+          <w:color w:val="C01F1F"/>
+        </w:rPr>
+        <w:t>[main.best_text]</w:t>
       </w:r>
       <w:r>
         <w:rPr/>
@@ -794,7 +818,7 @@
       </w:r>
       <w:r>
         <w:rPr/>
-        <w:t>0.142</w:t>
+        <w:t>0.218</w:t>
       </w:r>
       <w:r>
         <w:rPr/>
@@ -802,7 +826,7 @@
       </w:r>
       <w:r>
         <w:rPr/>
-        <w:t>0.071</w:t>
+        <w:t>0.121</w:t>
       </w:r>
       <w:r>
         <w:rPr/>
@@ -833,7 +857,7 @@
         </w:trPr>
         <w:tc>
           <w:tcPr>
-            <w:tcW w:type="dxa" w:w="786"/>
+            <w:tcW w:type="dxa" w:w="969"/>
             <w:tcBorders>
               <w:top w:val="single" w:sz="12" w:space="0" w:color="000000"/>
               <w:bottom w:val="single" w:sz="6" w:space="0" w:color="000000"/>
@@ -849,7 +873,7 @@
         </w:tc>
         <w:tc>
           <w:tcPr>
-            <w:tcW w:type="dxa" w:w="2014"/>
+            <w:tcW w:type="dxa" w:w="1976"/>
             <w:tcBorders>
               <w:top w:val="single" w:sz="12" w:space="0" w:color="000000"/>
               <w:bottom w:val="single" w:sz="6" w:space="0" w:color="000000"/>
@@ -918,7 +942,7 @@
         </w:tc>
         <w:tc>
           <w:tcPr>
-            <w:tcW w:type="dxa" w:w="1142"/>
+            <w:tcW w:type="dxa" w:w="997"/>
             <w:tcBorders>
               <w:top w:val="single" w:sz="12" w:space="0" w:color="000000"/>
               <w:bottom w:val="single" w:sz="6" w:space="0" w:color="000000"/>
@@ -935,7 +959,7 @@
                 <w:b/>
                 <w:sz w:val="16"/>
               </w:rPr>
-              <w:t>Rec@5%FPR</w:t>
+              <w:t>Rec@5% FPR</w:t>
             </w:r>
           </w:p>
         </w:tc>
@@ -1015,7 +1039,7 @@
         </w:trPr>
         <w:tc>
           <w:tcPr>
-            <w:tcW w:type="dxa" w:w="786"/>
+            <w:tcW w:type="dxa" w:w="969"/>
           </w:tcPr>
           <w:p>
             <w:pPr>
@@ -1033,7 +1057,7 @@
         </w:tc>
         <w:tc>
           <w:tcPr>
-            <w:tcW w:type="dxa" w:w="2014"/>
+            <w:tcW w:type="dxa" w:w="1976"/>
           </w:tcPr>
           <w:p>
             <w:pPr>
@@ -1046,894 +1070,6 @@
                 <w:sz w:val="16"/>
               </w:rPr>
               <w:t>Logistic regression</w:t>
-            </w:r>
-          </w:p>
-        </w:tc>
-        <w:tc>
-          <w:tcPr>
-            <w:tcW w:type="dxa" w:w="997"/>
-          </w:tcPr>
-          <w:p>
-            <w:pPr>
-              <w:keepNext/>
-              <w:spacing w:after="20"/>
-              <w:jc w:val="center"/>
-            </w:pPr>
-            <w:r>
-              <w:rPr>
-                <w:sz w:val="16"/>
-              </w:rPr>
-              <w:t>0.58 ± 0.17</w:t>
-            </w:r>
-          </w:p>
-        </w:tc>
-        <w:tc>
-          <w:tcPr>
-            <w:tcW w:type="dxa" w:w="997"/>
-          </w:tcPr>
-          <w:p>
-            <w:pPr>
-              <w:keepNext/>
-              <w:spacing w:after="20"/>
-              <w:jc w:val="center"/>
-            </w:pPr>
-            <w:r>
-              <w:rPr>
-                <w:sz w:val="16"/>
-              </w:rPr>
-              <w:t>0.83 ± 0.08</w:t>
-            </w:r>
-          </w:p>
-        </w:tc>
-        <w:tc>
-          <w:tcPr>
-            <w:tcW w:type="dxa" w:w="1142"/>
-          </w:tcPr>
-          <w:p>
-            <w:pPr>
-              <w:keepNext/>
-              <w:spacing w:after="20"/>
-              <w:jc w:val="center"/>
-            </w:pPr>
-            <w:r>
-              <w:rPr>
-                <w:sz w:val="16"/>
-              </w:rPr>
-              <w:t>0.33 ± 0.20</w:t>
-            </w:r>
-          </w:p>
-        </w:tc>
-        <w:tc>
-          <w:tcPr>
-            <w:tcW w:type="dxa" w:w="1142"/>
-          </w:tcPr>
-          <w:p>
-            <w:pPr>
-              <w:keepNext/>
-              <w:spacing w:after="20"/>
-              <w:jc w:val="center"/>
-            </w:pPr>
-            <w:r>
-              <w:rPr>
-                <w:sz w:val="16"/>
-              </w:rPr>
-              <w:t>0.35 ± 0.24</w:t>
-            </w:r>
-          </w:p>
-        </w:tc>
-        <w:tc>
-          <w:tcPr>
-            <w:tcW w:type="dxa" w:w="997"/>
-          </w:tcPr>
-          <w:p>
-            <w:pPr>
-              <w:keepNext/>
-              <w:spacing w:after="20"/>
-              <w:jc w:val="center"/>
-            </w:pPr>
-            <w:r>
-              <w:rPr>
-                <w:sz w:val="16"/>
-              </w:rPr>
-              <w:t>0.37 ± 0.27</w:t>
-            </w:r>
-          </w:p>
-        </w:tc>
-        <w:tc>
-          <w:tcPr>
-            <w:tcW w:type="dxa" w:w="997"/>
-          </w:tcPr>
-          <w:p>
-            <w:pPr>
-              <w:keepNext/>
-              <w:spacing w:after="20"/>
-              <w:jc w:val="center"/>
-            </w:pPr>
-            <w:r>
-              <w:rPr>
-                <w:sz w:val="16"/>
-              </w:rPr>
-              <w:t>0.31 ± 0.15</w:t>
-            </w:r>
-          </w:p>
-        </w:tc>
-      </w:tr>
-      <w:tr>
-        <w:trPr>
-          <w:cantSplit/>
-        </w:trPr>
-        <w:tc>
-          <w:tcPr>
-            <w:tcW w:type="dxa" w:w="786"/>
-          </w:tcPr>
-          <w:p>
-            <w:pPr>
-              <w:keepNext/>
-              <w:spacing w:after="20"/>
-              <w:jc w:val="left"/>
-            </w:pPr>
-          </w:p>
-        </w:tc>
-        <w:tc>
-          <w:tcPr>
-            <w:tcW w:type="dxa" w:w="2014"/>
-          </w:tcPr>
-          <w:p>
-            <w:pPr>
-              <w:keepNext/>
-              <w:spacing w:after="20"/>
-              <w:jc w:val="left"/>
-            </w:pPr>
-            <w:r>
-              <w:rPr>
-                <w:sz w:val="16"/>
-              </w:rPr>
-              <w:t>Random forest</w:t>
-            </w:r>
-          </w:p>
-        </w:tc>
-        <w:tc>
-          <w:tcPr>
-            <w:tcW w:type="dxa" w:w="997"/>
-          </w:tcPr>
-          <w:p>
-            <w:pPr>
-              <w:keepNext/>
-              <w:spacing w:after="20"/>
-              <w:jc w:val="center"/>
-            </w:pPr>
-            <w:r>
-              <w:rPr>
-                <w:sz w:val="16"/>
-              </w:rPr>
-              <w:t>0.62 ± 0.18</w:t>
-            </w:r>
-          </w:p>
-        </w:tc>
-        <w:tc>
-          <w:tcPr>
-            <w:tcW w:type="dxa" w:w="997"/>
-          </w:tcPr>
-          <w:p>
-            <w:pPr>
-              <w:keepNext/>
-              <w:spacing w:after="20"/>
-              <w:jc w:val="center"/>
-            </w:pPr>
-            <w:r>
-              <w:rPr>
-                <w:sz w:val="16"/>
-              </w:rPr>
-              <w:t>0.79 ± 0.15</w:t>
-            </w:r>
-          </w:p>
-        </w:tc>
-        <w:tc>
-          <w:tcPr>
-            <w:tcW w:type="dxa" w:w="1142"/>
-          </w:tcPr>
-          <w:p>
-            <w:pPr>
-              <w:keepNext/>
-              <w:spacing w:after="20"/>
-              <w:jc w:val="center"/>
-            </w:pPr>
-            <w:r>
-              <w:rPr>
-                <w:sz w:val="16"/>
-              </w:rPr>
-              <w:t>0.43 ± 0.24</w:t>
-            </w:r>
-          </w:p>
-        </w:tc>
-        <w:tc>
-          <w:tcPr>
-            <w:tcW w:type="dxa" w:w="1142"/>
-          </w:tcPr>
-          <w:p>
-            <w:pPr>
-              <w:keepNext/>
-              <w:spacing w:after="20"/>
-              <w:jc w:val="center"/>
-            </w:pPr>
-            <w:r>
-              <w:rPr>
-                <w:sz w:val="16"/>
-              </w:rPr>
-              <w:t>0.81 ± 0.17</w:t>
-            </w:r>
-          </w:p>
-        </w:tc>
-        <w:tc>
-          <w:tcPr>
-            <w:tcW w:type="dxa" w:w="997"/>
-          </w:tcPr>
-          <w:p>
-            <w:pPr>
-              <w:keepNext/>
-              <w:spacing w:after="20"/>
-              <w:jc w:val="center"/>
-            </w:pPr>
-            <w:r>
-              <w:rPr>
-                <w:sz w:val="16"/>
-              </w:rPr>
-              <w:t>0.43 ± 0.24</w:t>
-            </w:r>
-          </w:p>
-        </w:tc>
-        <w:tc>
-          <w:tcPr>
-            <w:tcW w:type="dxa" w:w="997"/>
-          </w:tcPr>
-          <w:p>
-            <w:pPr>
-              <w:keepNext/>
-              <w:spacing w:after="20"/>
-              <w:jc w:val="center"/>
-            </w:pPr>
-            <w:r>
-              <w:rPr>
-                <w:sz w:val="16"/>
-              </w:rPr>
-              <w:t>0.41 ± 0.20</w:t>
-            </w:r>
-          </w:p>
-        </w:tc>
-      </w:tr>
-      <w:tr>
-        <w:trPr>
-          <w:cantSplit/>
-        </w:trPr>
-        <w:tc>
-          <w:tcPr>
-            <w:tcW w:type="dxa" w:w="786"/>
-          </w:tcPr>
-          <w:p>
-            <w:pPr>
-              <w:keepNext/>
-              <w:spacing w:after="20"/>
-              <w:jc w:val="left"/>
-            </w:pPr>
-          </w:p>
-        </w:tc>
-        <w:tc>
-          <w:tcPr>
-            <w:tcW w:type="dxa" w:w="2014"/>
-          </w:tcPr>
-          <w:p>
-            <w:pPr>
-              <w:keepNext/>
-              <w:spacing w:after="20"/>
-              <w:jc w:val="left"/>
-            </w:pPr>
-            <w:r>
-              <w:rPr>
-                <w:sz w:val="16"/>
-              </w:rPr>
-              <w:t>XGBoost</w:t>
-            </w:r>
-          </w:p>
-        </w:tc>
-        <w:tc>
-          <w:tcPr>
-            <w:tcW w:type="dxa" w:w="997"/>
-          </w:tcPr>
-          <w:p>
-            <w:pPr>
-              <w:keepNext/>
-              <w:spacing w:after="20"/>
-              <w:jc w:val="center"/>
-            </w:pPr>
-            <w:r>
-              <w:rPr>
-                <w:sz w:val="16"/>
-              </w:rPr>
-              <w:t>0.54 ± 0.16</w:t>
-            </w:r>
-          </w:p>
-        </w:tc>
-        <w:tc>
-          <w:tcPr>
-            <w:tcW w:type="dxa" w:w="997"/>
-          </w:tcPr>
-          <w:p>
-            <w:pPr>
-              <w:keepNext/>
-              <w:spacing w:after="20"/>
-              <w:jc w:val="center"/>
-            </w:pPr>
-            <w:r>
-              <w:rPr>
-                <w:sz w:val="16"/>
-              </w:rPr>
-              <w:t>0.74 ± 0.15</w:t>
-            </w:r>
-          </w:p>
-        </w:tc>
-        <w:tc>
-          <w:tcPr>
-            <w:tcW w:type="dxa" w:w="1142"/>
-          </w:tcPr>
-          <w:p>
-            <w:pPr>
-              <w:keepNext/>
-              <w:spacing w:after="20"/>
-              <w:jc w:val="center"/>
-            </w:pPr>
-            <w:r>
-              <w:rPr>
-                <w:sz w:val="16"/>
-              </w:rPr>
-              <w:t>0.39 ± 0.26</w:t>
-            </w:r>
-          </w:p>
-        </w:tc>
-        <w:tc>
-          <w:tcPr>
-            <w:tcW w:type="dxa" w:w="1142"/>
-          </w:tcPr>
-          <w:p>
-            <w:pPr>
-              <w:keepNext/>
-              <w:spacing w:after="20"/>
-              <w:jc w:val="center"/>
-            </w:pPr>
-            <w:r>
-              <w:rPr>
-                <w:sz w:val="16"/>
-              </w:rPr>
-              <w:t>0.80 ± 0.27</w:t>
-            </w:r>
-          </w:p>
-        </w:tc>
-        <w:tc>
-          <w:tcPr>
-            <w:tcW w:type="dxa" w:w="997"/>
-          </w:tcPr>
-          <w:p>
-            <w:pPr>
-              <w:keepNext/>
-              <w:spacing w:after="20"/>
-              <w:jc w:val="center"/>
-            </w:pPr>
-            <w:r>
-              <w:rPr>
-                <w:sz w:val="16"/>
-              </w:rPr>
-              <w:t>0.37 ± 0.18</w:t>
-            </w:r>
-          </w:p>
-        </w:tc>
-        <w:tc>
-          <w:tcPr>
-            <w:tcW w:type="dxa" w:w="997"/>
-          </w:tcPr>
-          <w:p>
-            <w:pPr>
-              <w:keepNext/>
-              <w:spacing w:after="20"/>
-              <w:jc w:val="center"/>
-            </w:pPr>
-            <w:r>
-              <w:rPr>
-                <w:sz w:val="16"/>
-              </w:rPr>
-              <w:t>0.37 ± 0.13</w:t>
-            </w:r>
-          </w:p>
-        </w:tc>
-      </w:tr>
-      <w:tr>
-        <w:trPr>
-          <w:cantSplit/>
-        </w:trPr>
-        <w:tc>
-          <w:tcPr>
-            <w:tcW w:type="dxa" w:w="786"/>
-          </w:tcPr>
-          <w:p>
-            <w:pPr>
-              <w:keepNext/>
-              <w:spacing w:after="20"/>
-              <w:jc w:val="left"/>
-            </w:pPr>
-          </w:p>
-        </w:tc>
-        <w:tc>
-          <w:tcPr>
-            <w:tcW w:type="dxa" w:w="2014"/>
-          </w:tcPr>
-          <w:p>
-            <w:pPr>
-              <w:keepNext/>
-              <w:spacing w:after="20"/>
-              <w:jc w:val="left"/>
-            </w:pPr>
-            <w:r>
-              <w:rPr>
-                <w:sz w:val="16"/>
-              </w:rPr>
-              <w:t>LightGBM</w:t>
-            </w:r>
-          </w:p>
-        </w:tc>
-        <w:tc>
-          <w:tcPr>
-            <w:tcW w:type="dxa" w:w="997"/>
-          </w:tcPr>
-          <w:p>
-            <w:pPr>
-              <w:keepNext/>
-              <w:spacing w:after="20"/>
-              <w:jc w:val="center"/>
-            </w:pPr>
-            <w:r>
-              <w:rPr>
-                <w:sz w:val="16"/>
-              </w:rPr>
-              <w:t>0.59 ± 0.19</w:t>
-            </w:r>
-          </w:p>
-        </w:tc>
-        <w:tc>
-          <w:tcPr>
-            <w:tcW w:type="dxa" w:w="997"/>
-          </w:tcPr>
-          <w:p>
-            <w:pPr>
-              <w:keepNext/>
-              <w:spacing w:after="20"/>
-              <w:jc w:val="center"/>
-            </w:pPr>
-            <w:r>
-              <w:rPr>
-                <w:sz w:val="16"/>
-              </w:rPr>
-              <w:t>0.78 ± 0.15</w:t>
-            </w:r>
-          </w:p>
-        </w:tc>
-        <w:tc>
-          <w:tcPr>
-            <w:tcW w:type="dxa" w:w="1142"/>
-          </w:tcPr>
-          <w:p>
-            <w:pPr>
-              <w:keepNext/>
-              <w:spacing w:after="20"/>
-              <w:jc w:val="center"/>
-            </w:pPr>
-            <w:r>
-              <w:rPr>
-                <w:sz w:val="16"/>
-              </w:rPr>
-              <w:t>0.43 ± 0.24</w:t>
-            </w:r>
-          </w:p>
-        </w:tc>
-        <w:tc>
-          <w:tcPr>
-            <w:tcW w:type="dxa" w:w="1142"/>
-          </w:tcPr>
-          <w:p>
-            <w:pPr>
-              <w:keepNext/>
-              <w:spacing w:after="20"/>
-              <w:jc w:val="center"/>
-            </w:pPr>
-            <w:r>
-              <w:rPr>
-                <w:sz w:val="16"/>
-              </w:rPr>
-              <w:t>0.52 ± 0.28</w:t>
-            </w:r>
-          </w:p>
-        </w:tc>
-        <w:tc>
-          <w:tcPr>
-            <w:tcW w:type="dxa" w:w="997"/>
-          </w:tcPr>
-          <w:p>
-            <w:pPr>
-              <w:keepNext/>
-              <w:spacing w:after="20"/>
-              <w:jc w:val="center"/>
-            </w:pPr>
-            <w:r>
-              <w:rPr>
-                <w:sz w:val="16"/>
-              </w:rPr>
-              <w:t>0.41 ± 0.23</w:t>
-            </w:r>
-          </w:p>
-        </w:tc>
-        <w:tc>
-          <w:tcPr>
-            <w:tcW w:type="dxa" w:w="997"/>
-          </w:tcPr>
-          <w:p>
-            <w:pPr>
-              <w:keepNext/>
-              <w:spacing w:after="20"/>
-              <w:jc w:val="center"/>
-            </w:pPr>
-            <w:r>
-              <w:rPr>
-                <w:sz w:val="16"/>
-              </w:rPr>
-              <w:t>0.38 ± 0.22</w:t>
-            </w:r>
-          </w:p>
-        </w:tc>
-      </w:tr>
-      <w:tr>
-        <w:trPr>
-          <w:cantSplit/>
-        </w:trPr>
-        <w:tc>
-          <w:tcPr>
-            <w:tcW w:type="dxa" w:w="786"/>
-            <w:tcBorders>
-              <w:top w:val="single" w:sz="4" w:space="0" w:color="000000"/>
-            </w:tcBorders>
-          </w:tcPr>
-          <w:p>
-            <w:pPr>
-              <w:keepNext/>
-              <w:spacing w:after="20"/>
-              <w:jc w:val="left"/>
-            </w:pPr>
-            <w:r>
-              <w:rPr>
-                <w:sz w:val="16"/>
-              </w:rPr>
-              <w:t>Text</w:t>
-            </w:r>
-          </w:p>
-        </w:tc>
-        <w:tc>
-          <w:tcPr>
-            <w:tcW w:type="dxa" w:w="2014"/>
-            <w:tcBorders>
-              <w:top w:val="single" w:sz="4" w:space="0" w:color="000000"/>
-            </w:tcBorders>
-          </w:tcPr>
-          <w:p>
-            <w:pPr>
-              <w:keepNext/>
-              <w:spacing w:after="20"/>
-              <w:jc w:val="left"/>
-            </w:pPr>
-            <w:r>
-              <w:rPr>
-                <w:sz w:val="16"/>
-              </w:rPr>
-              <w:t>TF-IDF + LR</w:t>
-            </w:r>
-          </w:p>
-        </w:tc>
-        <w:tc>
-          <w:tcPr>
-            <w:tcW w:type="dxa" w:w="997"/>
-            <w:tcBorders>
-              <w:top w:val="single" w:sz="4" w:space="0" w:color="000000"/>
-            </w:tcBorders>
-          </w:tcPr>
-          <w:p>
-            <w:pPr>
-              <w:keepNext/>
-              <w:spacing w:after="20"/>
-              <w:jc w:val="center"/>
-            </w:pPr>
-            <w:r>
-              <w:rPr>
-                <w:sz w:val="16"/>
-              </w:rPr>
-              <w:t>0.38 ± 0.20</w:t>
-            </w:r>
-          </w:p>
-        </w:tc>
-        <w:tc>
-          <w:tcPr>
-            <w:tcW w:type="dxa" w:w="997"/>
-            <w:tcBorders>
-              <w:top w:val="single" w:sz="4" w:space="0" w:color="000000"/>
-            </w:tcBorders>
-          </w:tcPr>
-          <w:p>
-            <w:pPr>
-              <w:keepNext/>
-              <w:spacing w:after="20"/>
-              <w:jc w:val="center"/>
-            </w:pPr>
-            <w:r>
-              <w:rPr>
-                <w:sz w:val="16"/>
-              </w:rPr>
-              <w:t>0.62 ± 0.15</w:t>
-            </w:r>
-          </w:p>
-        </w:tc>
-        <w:tc>
-          <w:tcPr>
-            <w:tcW w:type="dxa" w:w="1142"/>
-            <w:tcBorders>
-              <w:top w:val="single" w:sz="4" w:space="0" w:color="000000"/>
-            </w:tcBorders>
-          </w:tcPr>
-          <w:p>
-            <w:pPr>
-              <w:keepNext/>
-              <w:spacing w:after="20"/>
-              <w:jc w:val="center"/>
-            </w:pPr>
-            <w:r>
-              <w:rPr>
-                <w:sz w:val="16"/>
-              </w:rPr>
-              <w:t>0.32 ± 0.26</w:t>
-            </w:r>
-          </w:p>
-        </w:tc>
-        <w:tc>
-          <w:tcPr>
-            <w:tcW w:type="dxa" w:w="1142"/>
-            <w:tcBorders>
-              <w:top w:val="single" w:sz="4" w:space="0" w:color="000000"/>
-            </w:tcBorders>
-          </w:tcPr>
-          <w:p>
-            <w:pPr>
-              <w:keepNext/>
-              <w:spacing w:after="20"/>
-              <w:jc w:val="center"/>
-            </w:pPr>
-            <w:r>
-              <w:rPr>
-                <w:sz w:val="16"/>
-              </w:rPr>
-              <w:t>0.30 ± 0.31</w:t>
-            </w:r>
-          </w:p>
-        </w:tc>
-        <w:tc>
-          <w:tcPr>
-            <w:tcW w:type="dxa" w:w="997"/>
-            <w:tcBorders>
-              <w:top w:val="single" w:sz="4" w:space="0" w:color="000000"/>
-            </w:tcBorders>
-          </w:tcPr>
-          <w:p>
-            <w:pPr>
-              <w:keepNext/>
-              <w:spacing w:after="20"/>
-              <w:jc w:val="center"/>
-            </w:pPr>
-            <w:r>
-              <w:rPr>
-                <w:sz w:val="16"/>
-              </w:rPr>
-              <w:t>0.27 ± 0.22</w:t>
-            </w:r>
-          </w:p>
-        </w:tc>
-        <w:tc>
-          <w:tcPr>
-            <w:tcW w:type="dxa" w:w="997"/>
-            <w:tcBorders>
-              <w:top w:val="single" w:sz="4" w:space="0" w:color="000000"/>
-            </w:tcBorders>
-          </w:tcPr>
-          <w:p>
-            <w:pPr>
-              <w:keepNext/>
-              <w:spacing w:after="20"/>
-              <w:jc w:val="center"/>
-            </w:pPr>
-            <w:r>
-              <w:rPr>
-                <w:sz w:val="16"/>
-              </w:rPr>
-              <w:t>0.20 ± 0.09</w:t>
-            </w:r>
-          </w:p>
-        </w:tc>
-      </w:tr>
-      <w:tr>
-        <w:trPr>
-          <w:cantSplit/>
-        </w:trPr>
-        <w:tc>
-          <w:tcPr>
-            <w:tcW w:type="dxa" w:w="786"/>
-          </w:tcPr>
-          <w:p>
-            <w:pPr>
-              <w:keepNext/>
-              <w:spacing w:after="20"/>
-              <w:jc w:val="left"/>
-            </w:pPr>
-          </w:p>
-        </w:tc>
-        <w:tc>
-          <w:tcPr>
-            <w:tcW w:type="dxa" w:w="2014"/>
-          </w:tcPr>
-          <w:p>
-            <w:pPr>
-              <w:keepNext/>
-              <w:spacing w:after="20"/>
-              <w:jc w:val="left"/>
-            </w:pPr>
-            <w:r>
-              <w:rPr>
-                <w:sz w:val="16"/>
-              </w:rPr>
-              <w:t>TF-IDF + SVM</w:t>
-            </w:r>
-          </w:p>
-        </w:tc>
-        <w:tc>
-          <w:tcPr>
-            <w:tcW w:type="dxa" w:w="997"/>
-          </w:tcPr>
-          <w:p>
-            <w:pPr>
-              <w:keepNext/>
-              <w:spacing w:after="20"/>
-              <w:jc w:val="center"/>
-            </w:pPr>
-            <w:r>
-              <w:rPr>
-                <w:sz w:val="16"/>
-              </w:rPr>
-              <w:t>0.41 ± 0.22</w:t>
-            </w:r>
-          </w:p>
-        </w:tc>
-        <w:tc>
-          <w:tcPr>
-            <w:tcW w:type="dxa" w:w="997"/>
-          </w:tcPr>
-          <w:p>
-            <w:pPr>
-              <w:keepNext/>
-              <w:spacing w:after="20"/>
-              <w:jc w:val="center"/>
-            </w:pPr>
-            <w:r>
-              <w:rPr>
-                <w:sz w:val="16"/>
-              </w:rPr>
-              <w:t>0.62 ± 0.16</w:t>
-            </w:r>
-          </w:p>
-        </w:tc>
-        <w:tc>
-          <w:tcPr>
-            <w:tcW w:type="dxa" w:w="1142"/>
-          </w:tcPr>
-          <w:p>
-            <w:pPr>
-              <w:keepNext/>
-              <w:spacing w:after="20"/>
-              <w:jc w:val="center"/>
-            </w:pPr>
-            <w:r>
-              <w:rPr>
-                <w:sz w:val="16"/>
-              </w:rPr>
-              <w:t>0.34 ± 0.23</w:t>
-            </w:r>
-          </w:p>
-        </w:tc>
-        <w:tc>
-          <w:tcPr>
-            <w:tcW w:type="dxa" w:w="1142"/>
-          </w:tcPr>
-          <w:p>
-            <w:pPr>
-              <w:keepNext/>
-              <w:spacing w:after="20"/>
-              <w:jc w:val="center"/>
-            </w:pPr>
-            <w:r>
-              <w:rPr>
-                <w:sz w:val="16"/>
-              </w:rPr>
-              <w:t>0.14 ± 0.14</w:t>
-            </w:r>
-          </w:p>
-        </w:tc>
-        <w:tc>
-          <w:tcPr>
-            <w:tcW w:type="dxa" w:w="997"/>
-          </w:tcPr>
-          <w:p>
-            <w:pPr>
-              <w:keepNext/>
-              <w:spacing w:after="20"/>
-              <w:jc w:val="center"/>
-            </w:pPr>
-            <w:r>
-              <w:rPr>
-                <w:sz w:val="16"/>
-              </w:rPr>
-              <w:t>0.35 ± 0.35</w:t>
-            </w:r>
-          </w:p>
-        </w:tc>
-        <w:tc>
-          <w:tcPr>
-            <w:tcW w:type="dxa" w:w="997"/>
-          </w:tcPr>
-          <w:p>
-            <w:pPr>
-              <w:keepNext/>
-              <w:spacing w:after="20"/>
-              <w:jc w:val="center"/>
-            </w:pPr>
-            <w:r>
-              <w:rPr>
-                <w:sz w:val="16"/>
-              </w:rPr>
-              <w:t>0.20 ± 0.09</w:t>
-            </w:r>
-          </w:p>
-        </w:tc>
-      </w:tr>
-      <w:tr>
-        <w:trPr>
-          <w:cantSplit/>
-        </w:trPr>
-        <w:tc>
-          <w:tcPr>
-            <w:tcW w:type="dxa" w:w="786"/>
-          </w:tcPr>
-          <w:p>
-            <w:pPr>
-              <w:keepNext/>
-              <w:spacing w:after="20"/>
-              <w:jc w:val="left"/>
-            </w:pPr>
-          </w:p>
-        </w:tc>
-        <w:tc>
-          <w:tcPr>
-            <w:tcW w:type="dxa" w:w="2014"/>
-          </w:tcPr>
-          <w:p>
-            <w:pPr>
-              <w:keepNext/>
-              <w:spacing w:after="20"/>
-              <w:jc w:val="left"/>
-            </w:pPr>
-            <w:r>
-              <w:rPr>
-                <w:sz w:val="16"/>
-              </w:rPr>
-              <w:t>MuRIL</w:t>
             </w:r>
           </w:p>
         </w:tc>
@@ -1979,7 +1115,7 @@
         </w:tc>
         <w:tc>
           <w:tcPr>
-            <w:tcW w:type="dxa" w:w="1142"/>
+            <w:tcW w:type="dxa" w:w="997"/>
           </w:tcPr>
           <w:p>
             <w:pPr>
@@ -2064,7 +1200,967 @@
         </w:trPr>
         <w:tc>
           <w:tcPr>
-            <w:tcW w:type="dxa" w:w="786"/>
+            <w:tcW w:type="dxa" w:w="969"/>
+          </w:tcPr>
+          <w:p>
+            <w:pPr>
+              <w:keepNext/>
+              <w:spacing w:after="20"/>
+              <w:jc w:val="left"/>
+            </w:pPr>
+          </w:p>
+        </w:tc>
+        <w:tc>
+          <w:tcPr>
+            <w:tcW w:type="dxa" w:w="1976"/>
+          </w:tcPr>
+          <w:p>
+            <w:pPr>
+              <w:keepNext/>
+              <w:spacing w:after="20"/>
+              <w:jc w:val="left"/>
+            </w:pPr>
+            <w:r>
+              <w:rPr>
+                <w:sz w:val="16"/>
+              </w:rPr>
+              <w:t>Random forest</w:t>
+            </w:r>
+          </w:p>
+        </w:tc>
+        <w:tc>
+          <w:tcPr>
+            <w:tcW w:type="dxa" w:w="997"/>
+          </w:tcPr>
+          <w:p>
+            <w:pPr>
+              <w:keepNext/>
+              <w:spacing w:after="20"/>
+              <w:jc w:val="center"/>
+            </w:pPr>
+            <w:r>
+              <w:rPr>
+                <w:i w:val="0"/>
+                <w:color w:val="C01F1F"/>
+                <w:sz w:val="16"/>
+              </w:rPr>
+              <w:t>[TBD]</w:t>
+            </w:r>
+          </w:p>
+        </w:tc>
+        <w:tc>
+          <w:tcPr>
+            <w:tcW w:type="dxa" w:w="997"/>
+          </w:tcPr>
+          <w:p>
+            <w:pPr>
+              <w:keepNext/>
+              <w:spacing w:after="20"/>
+              <w:jc w:val="center"/>
+            </w:pPr>
+            <w:r>
+              <w:rPr>
+                <w:i w:val="0"/>
+                <w:color w:val="C01F1F"/>
+                <w:sz w:val="16"/>
+              </w:rPr>
+              <w:t>[TBD]</w:t>
+            </w:r>
+          </w:p>
+        </w:tc>
+        <w:tc>
+          <w:tcPr>
+            <w:tcW w:type="dxa" w:w="997"/>
+          </w:tcPr>
+          <w:p>
+            <w:pPr>
+              <w:keepNext/>
+              <w:spacing w:after="20"/>
+              <w:jc w:val="center"/>
+            </w:pPr>
+            <w:r>
+              <w:rPr>
+                <w:i w:val="0"/>
+                <w:color w:val="C01F1F"/>
+                <w:sz w:val="16"/>
+              </w:rPr>
+              <w:t>[TBD]</w:t>
+            </w:r>
+          </w:p>
+        </w:tc>
+        <w:tc>
+          <w:tcPr>
+            <w:tcW w:type="dxa" w:w="1142"/>
+          </w:tcPr>
+          <w:p>
+            <w:pPr>
+              <w:keepNext/>
+              <w:spacing w:after="20"/>
+              <w:jc w:val="center"/>
+            </w:pPr>
+            <w:r>
+              <w:rPr>
+                <w:i w:val="0"/>
+                <w:color w:val="C01F1F"/>
+                <w:sz w:val="16"/>
+              </w:rPr>
+              <w:t>[TBD]</w:t>
+            </w:r>
+          </w:p>
+        </w:tc>
+        <w:tc>
+          <w:tcPr>
+            <w:tcW w:type="dxa" w:w="997"/>
+          </w:tcPr>
+          <w:p>
+            <w:pPr>
+              <w:keepNext/>
+              <w:spacing w:after="20"/>
+              <w:jc w:val="center"/>
+            </w:pPr>
+            <w:r>
+              <w:rPr>
+                <w:i w:val="0"/>
+                <w:color w:val="C01F1F"/>
+                <w:sz w:val="16"/>
+              </w:rPr>
+              <w:t>[TBD]</w:t>
+            </w:r>
+          </w:p>
+        </w:tc>
+        <w:tc>
+          <w:tcPr>
+            <w:tcW w:type="dxa" w:w="997"/>
+          </w:tcPr>
+          <w:p>
+            <w:pPr>
+              <w:keepNext/>
+              <w:spacing w:after="20"/>
+              <w:jc w:val="center"/>
+            </w:pPr>
+            <w:r>
+              <w:rPr>
+                <w:i w:val="0"/>
+                <w:color w:val="C01F1F"/>
+                <w:sz w:val="16"/>
+              </w:rPr>
+              <w:t>[TBD]</w:t>
+            </w:r>
+          </w:p>
+        </w:tc>
+      </w:tr>
+      <w:tr>
+        <w:trPr>
+          <w:cantSplit/>
+        </w:trPr>
+        <w:tc>
+          <w:tcPr>
+            <w:tcW w:type="dxa" w:w="969"/>
+          </w:tcPr>
+          <w:p>
+            <w:pPr>
+              <w:keepNext/>
+              <w:spacing w:after="20"/>
+              <w:jc w:val="left"/>
+            </w:pPr>
+          </w:p>
+        </w:tc>
+        <w:tc>
+          <w:tcPr>
+            <w:tcW w:type="dxa" w:w="1976"/>
+          </w:tcPr>
+          <w:p>
+            <w:pPr>
+              <w:keepNext/>
+              <w:spacing w:after="20"/>
+              <w:jc w:val="left"/>
+            </w:pPr>
+            <w:r>
+              <w:rPr>
+                <w:sz w:val="16"/>
+              </w:rPr>
+              <w:t>XGBoost</w:t>
+            </w:r>
+          </w:p>
+        </w:tc>
+        <w:tc>
+          <w:tcPr>
+            <w:tcW w:type="dxa" w:w="997"/>
+          </w:tcPr>
+          <w:p>
+            <w:pPr>
+              <w:keepNext/>
+              <w:spacing w:after="20"/>
+              <w:jc w:val="center"/>
+            </w:pPr>
+            <w:r>
+              <w:rPr>
+                <w:i w:val="0"/>
+                <w:color w:val="C01F1F"/>
+                <w:sz w:val="16"/>
+              </w:rPr>
+              <w:t>[TBD]</w:t>
+            </w:r>
+          </w:p>
+        </w:tc>
+        <w:tc>
+          <w:tcPr>
+            <w:tcW w:type="dxa" w:w="997"/>
+          </w:tcPr>
+          <w:p>
+            <w:pPr>
+              <w:keepNext/>
+              <w:spacing w:after="20"/>
+              <w:jc w:val="center"/>
+            </w:pPr>
+            <w:r>
+              <w:rPr>
+                <w:i w:val="0"/>
+                <w:color w:val="C01F1F"/>
+                <w:sz w:val="16"/>
+              </w:rPr>
+              <w:t>[TBD]</w:t>
+            </w:r>
+          </w:p>
+        </w:tc>
+        <w:tc>
+          <w:tcPr>
+            <w:tcW w:type="dxa" w:w="997"/>
+          </w:tcPr>
+          <w:p>
+            <w:pPr>
+              <w:keepNext/>
+              <w:spacing w:after="20"/>
+              <w:jc w:val="center"/>
+            </w:pPr>
+            <w:r>
+              <w:rPr>
+                <w:i w:val="0"/>
+                <w:color w:val="C01F1F"/>
+                <w:sz w:val="16"/>
+              </w:rPr>
+              <w:t>[TBD]</w:t>
+            </w:r>
+          </w:p>
+        </w:tc>
+        <w:tc>
+          <w:tcPr>
+            <w:tcW w:type="dxa" w:w="1142"/>
+          </w:tcPr>
+          <w:p>
+            <w:pPr>
+              <w:keepNext/>
+              <w:spacing w:after="20"/>
+              <w:jc w:val="center"/>
+            </w:pPr>
+            <w:r>
+              <w:rPr>
+                <w:i w:val="0"/>
+                <w:color w:val="C01F1F"/>
+                <w:sz w:val="16"/>
+              </w:rPr>
+              <w:t>[TBD]</w:t>
+            </w:r>
+          </w:p>
+        </w:tc>
+        <w:tc>
+          <w:tcPr>
+            <w:tcW w:type="dxa" w:w="997"/>
+          </w:tcPr>
+          <w:p>
+            <w:pPr>
+              <w:keepNext/>
+              <w:spacing w:after="20"/>
+              <w:jc w:val="center"/>
+            </w:pPr>
+            <w:r>
+              <w:rPr>
+                <w:i w:val="0"/>
+                <w:color w:val="C01F1F"/>
+                <w:sz w:val="16"/>
+              </w:rPr>
+              <w:t>[TBD]</w:t>
+            </w:r>
+          </w:p>
+        </w:tc>
+        <w:tc>
+          <w:tcPr>
+            <w:tcW w:type="dxa" w:w="997"/>
+          </w:tcPr>
+          <w:p>
+            <w:pPr>
+              <w:keepNext/>
+              <w:spacing w:after="20"/>
+              <w:jc w:val="center"/>
+            </w:pPr>
+            <w:r>
+              <w:rPr>
+                <w:i w:val="0"/>
+                <w:color w:val="C01F1F"/>
+                <w:sz w:val="16"/>
+              </w:rPr>
+              <w:t>[TBD]</w:t>
+            </w:r>
+          </w:p>
+        </w:tc>
+      </w:tr>
+      <w:tr>
+        <w:trPr>
+          <w:cantSplit/>
+        </w:trPr>
+        <w:tc>
+          <w:tcPr>
+            <w:tcW w:type="dxa" w:w="969"/>
+          </w:tcPr>
+          <w:p>
+            <w:pPr>
+              <w:keepNext/>
+              <w:spacing w:after="20"/>
+              <w:jc w:val="left"/>
+            </w:pPr>
+          </w:p>
+        </w:tc>
+        <w:tc>
+          <w:tcPr>
+            <w:tcW w:type="dxa" w:w="1976"/>
+          </w:tcPr>
+          <w:p>
+            <w:pPr>
+              <w:keepNext/>
+              <w:spacing w:after="20"/>
+              <w:jc w:val="left"/>
+            </w:pPr>
+            <w:r>
+              <w:rPr>
+                <w:sz w:val="16"/>
+              </w:rPr>
+              <w:t>LightGBM</w:t>
+            </w:r>
+          </w:p>
+        </w:tc>
+        <w:tc>
+          <w:tcPr>
+            <w:tcW w:type="dxa" w:w="997"/>
+          </w:tcPr>
+          <w:p>
+            <w:pPr>
+              <w:keepNext/>
+              <w:spacing w:after="20"/>
+              <w:jc w:val="center"/>
+            </w:pPr>
+            <w:r>
+              <w:rPr>
+                <w:i w:val="0"/>
+                <w:color w:val="C01F1F"/>
+                <w:sz w:val="16"/>
+              </w:rPr>
+              <w:t>[TBD]</w:t>
+            </w:r>
+          </w:p>
+        </w:tc>
+        <w:tc>
+          <w:tcPr>
+            <w:tcW w:type="dxa" w:w="997"/>
+          </w:tcPr>
+          <w:p>
+            <w:pPr>
+              <w:keepNext/>
+              <w:spacing w:after="20"/>
+              <w:jc w:val="center"/>
+            </w:pPr>
+            <w:r>
+              <w:rPr>
+                <w:i w:val="0"/>
+                <w:color w:val="C01F1F"/>
+                <w:sz w:val="16"/>
+              </w:rPr>
+              <w:t>[TBD]</w:t>
+            </w:r>
+          </w:p>
+        </w:tc>
+        <w:tc>
+          <w:tcPr>
+            <w:tcW w:type="dxa" w:w="997"/>
+          </w:tcPr>
+          <w:p>
+            <w:pPr>
+              <w:keepNext/>
+              <w:spacing w:after="20"/>
+              <w:jc w:val="center"/>
+            </w:pPr>
+            <w:r>
+              <w:rPr>
+                <w:i w:val="0"/>
+                <w:color w:val="C01F1F"/>
+                <w:sz w:val="16"/>
+              </w:rPr>
+              <w:t>[TBD]</w:t>
+            </w:r>
+          </w:p>
+        </w:tc>
+        <w:tc>
+          <w:tcPr>
+            <w:tcW w:type="dxa" w:w="1142"/>
+          </w:tcPr>
+          <w:p>
+            <w:pPr>
+              <w:keepNext/>
+              <w:spacing w:after="20"/>
+              <w:jc w:val="center"/>
+            </w:pPr>
+            <w:r>
+              <w:rPr>
+                <w:i w:val="0"/>
+                <w:color w:val="C01F1F"/>
+                <w:sz w:val="16"/>
+              </w:rPr>
+              <w:t>[TBD]</w:t>
+            </w:r>
+          </w:p>
+        </w:tc>
+        <w:tc>
+          <w:tcPr>
+            <w:tcW w:type="dxa" w:w="997"/>
+          </w:tcPr>
+          <w:p>
+            <w:pPr>
+              <w:keepNext/>
+              <w:spacing w:after="20"/>
+              <w:jc w:val="center"/>
+            </w:pPr>
+            <w:r>
+              <w:rPr>
+                <w:i w:val="0"/>
+                <w:color w:val="C01F1F"/>
+                <w:sz w:val="16"/>
+              </w:rPr>
+              <w:t>[TBD]</w:t>
+            </w:r>
+          </w:p>
+        </w:tc>
+        <w:tc>
+          <w:tcPr>
+            <w:tcW w:type="dxa" w:w="997"/>
+          </w:tcPr>
+          <w:p>
+            <w:pPr>
+              <w:keepNext/>
+              <w:spacing w:after="20"/>
+              <w:jc w:val="center"/>
+            </w:pPr>
+            <w:r>
+              <w:rPr>
+                <w:i w:val="0"/>
+                <w:color w:val="C01F1F"/>
+                <w:sz w:val="16"/>
+              </w:rPr>
+              <w:t>[TBD]</w:t>
+            </w:r>
+          </w:p>
+        </w:tc>
+      </w:tr>
+      <w:tr>
+        <w:trPr>
+          <w:cantSplit/>
+        </w:trPr>
+        <w:tc>
+          <w:tcPr>
+            <w:tcW w:type="dxa" w:w="969"/>
+            <w:tcBorders>
+              <w:top w:val="single" w:sz="4" w:space="0" w:color="000000"/>
+            </w:tcBorders>
+          </w:tcPr>
+          <w:p>
+            <w:pPr>
+              <w:keepNext/>
+              <w:spacing w:after="20"/>
+              <w:jc w:val="left"/>
+            </w:pPr>
+            <w:r>
+              <w:rPr>
+                <w:sz w:val="16"/>
+              </w:rPr>
+              <w:t>Text</w:t>
+            </w:r>
+          </w:p>
+        </w:tc>
+        <w:tc>
+          <w:tcPr>
+            <w:tcW w:type="dxa" w:w="1976"/>
+            <w:tcBorders>
+              <w:top w:val="single" w:sz="4" w:space="0" w:color="000000"/>
+            </w:tcBorders>
+          </w:tcPr>
+          <w:p>
+            <w:pPr>
+              <w:keepNext/>
+              <w:spacing w:after="20"/>
+              <w:jc w:val="left"/>
+            </w:pPr>
+            <w:r>
+              <w:rPr>
+                <w:sz w:val="16"/>
+              </w:rPr>
+              <w:t>TF-IDF + LR</w:t>
+            </w:r>
+          </w:p>
+        </w:tc>
+        <w:tc>
+          <w:tcPr>
+            <w:tcW w:type="dxa" w:w="997"/>
+            <w:tcBorders>
+              <w:top w:val="single" w:sz="4" w:space="0" w:color="000000"/>
+            </w:tcBorders>
+          </w:tcPr>
+          <w:p>
+            <w:pPr>
+              <w:keepNext/>
+              <w:spacing w:after="20"/>
+              <w:jc w:val="center"/>
+            </w:pPr>
+            <w:r>
+              <w:rPr>
+                <w:i w:val="0"/>
+                <w:color w:val="C01F1F"/>
+                <w:sz w:val="16"/>
+              </w:rPr>
+              <w:t>[TBD]</w:t>
+            </w:r>
+          </w:p>
+        </w:tc>
+        <w:tc>
+          <w:tcPr>
+            <w:tcW w:type="dxa" w:w="997"/>
+            <w:tcBorders>
+              <w:top w:val="single" w:sz="4" w:space="0" w:color="000000"/>
+            </w:tcBorders>
+          </w:tcPr>
+          <w:p>
+            <w:pPr>
+              <w:keepNext/>
+              <w:spacing w:after="20"/>
+              <w:jc w:val="center"/>
+            </w:pPr>
+            <w:r>
+              <w:rPr>
+                <w:i w:val="0"/>
+                <w:color w:val="C01F1F"/>
+                <w:sz w:val="16"/>
+              </w:rPr>
+              <w:t>[TBD]</w:t>
+            </w:r>
+          </w:p>
+        </w:tc>
+        <w:tc>
+          <w:tcPr>
+            <w:tcW w:type="dxa" w:w="997"/>
+            <w:tcBorders>
+              <w:top w:val="single" w:sz="4" w:space="0" w:color="000000"/>
+            </w:tcBorders>
+          </w:tcPr>
+          <w:p>
+            <w:pPr>
+              <w:keepNext/>
+              <w:spacing w:after="20"/>
+              <w:jc w:val="center"/>
+            </w:pPr>
+            <w:r>
+              <w:rPr>
+                <w:i w:val="0"/>
+                <w:color w:val="C01F1F"/>
+                <w:sz w:val="16"/>
+              </w:rPr>
+              <w:t>[TBD]</w:t>
+            </w:r>
+          </w:p>
+        </w:tc>
+        <w:tc>
+          <w:tcPr>
+            <w:tcW w:type="dxa" w:w="1142"/>
+            <w:tcBorders>
+              <w:top w:val="single" w:sz="4" w:space="0" w:color="000000"/>
+            </w:tcBorders>
+          </w:tcPr>
+          <w:p>
+            <w:pPr>
+              <w:keepNext/>
+              <w:spacing w:after="20"/>
+              <w:jc w:val="center"/>
+            </w:pPr>
+            <w:r>
+              <w:rPr>
+                <w:i w:val="0"/>
+                <w:color w:val="C01F1F"/>
+                <w:sz w:val="16"/>
+              </w:rPr>
+              <w:t>[TBD]</w:t>
+            </w:r>
+          </w:p>
+        </w:tc>
+        <w:tc>
+          <w:tcPr>
+            <w:tcW w:type="dxa" w:w="997"/>
+            <w:tcBorders>
+              <w:top w:val="single" w:sz="4" w:space="0" w:color="000000"/>
+            </w:tcBorders>
+          </w:tcPr>
+          <w:p>
+            <w:pPr>
+              <w:keepNext/>
+              <w:spacing w:after="20"/>
+              <w:jc w:val="center"/>
+            </w:pPr>
+            <w:r>
+              <w:rPr>
+                <w:i w:val="0"/>
+                <w:color w:val="C01F1F"/>
+                <w:sz w:val="16"/>
+              </w:rPr>
+              <w:t>[TBD]</w:t>
+            </w:r>
+          </w:p>
+        </w:tc>
+        <w:tc>
+          <w:tcPr>
+            <w:tcW w:type="dxa" w:w="997"/>
+            <w:tcBorders>
+              <w:top w:val="single" w:sz="4" w:space="0" w:color="000000"/>
+            </w:tcBorders>
+          </w:tcPr>
+          <w:p>
+            <w:pPr>
+              <w:keepNext/>
+              <w:spacing w:after="20"/>
+              <w:jc w:val="center"/>
+            </w:pPr>
+            <w:r>
+              <w:rPr>
+                <w:i w:val="0"/>
+                <w:color w:val="C01F1F"/>
+                <w:sz w:val="16"/>
+              </w:rPr>
+              <w:t>[TBD]</w:t>
+            </w:r>
+          </w:p>
+        </w:tc>
+      </w:tr>
+      <w:tr>
+        <w:trPr>
+          <w:cantSplit/>
+        </w:trPr>
+        <w:tc>
+          <w:tcPr>
+            <w:tcW w:type="dxa" w:w="969"/>
+          </w:tcPr>
+          <w:p>
+            <w:pPr>
+              <w:keepNext/>
+              <w:spacing w:after="20"/>
+              <w:jc w:val="left"/>
+            </w:pPr>
+          </w:p>
+        </w:tc>
+        <w:tc>
+          <w:tcPr>
+            <w:tcW w:type="dxa" w:w="1976"/>
+          </w:tcPr>
+          <w:p>
+            <w:pPr>
+              <w:keepNext/>
+              <w:spacing w:after="20"/>
+              <w:jc w:val="left"/>
+            </w:pPr>
+            <w:r>
+              <w:rPr>
+                <w:sz w:val="16"/>
+              </w:rPr>
+              <w:t>TF-IDF + SVM</w:t>
+            </w:r>
+          </w:p>
+        </w:tc>
+        <w:tc>
+          <w:tcPr>
+            <w:tcW w:type="dxa" w:w="997"/>
+          </w:tcPr>
+          <w:p>
+            <w:pPr>
+              <w:keepNext/>
+              <w:spacing w:after="20"/>
+              <w:jc w:val="center"/>
+            </w:pPr>
+            <w:r>
+              <w:rPr>
+                <w:i w:val="0"/>
+                <w:color w:val="C01F1F"/>
+                <w:sz w:val="16"/>
+              </w:rPr>
+              <w:t>[TBD]</w:t>
+            </w:r>
+          </w:p>
+        </w:tc>
+        <w:tc>
+          <w:tcPr>
+            <w:tcW w:type="dxa" w:w="997"/>
+          </w:tcPr>
+          <w:p>
+            <w:pPr>
+              <w:keepNext/>
+              <w:spacing w:after="20"/>
+              <w:jc w:val="center"/>
+            </w:pPr>
+            <w:r>
+              <w:rPr>
+                <w:i w:val="0"/>
+                <w:color w:val="C01F1F"/>
+                <w:sz w:val="16"/>
+              </w:rPr>
+              <w:t>[TBD]</w:t>
+            </w:r>
+          </w:p>
+        </w:tc>
+        <w:tc>
+          <w:tcPr>
+            <w:tcW w:type="dxa" w:w="997"/>
+          </w:tcPr>
+          <w:p>
+            <w:pPr>
+              <w:keepNext/>
+              <w:spacing w:after="20"/>
+              <w:jc w:val="center"/>
+            </w:pPr>
+            <w:r>
+              <w:rPr>
+                <w:i w:val="0"/>
+                <w:color w:val="C01F1F"/>
+                <w:sz w:val="16"/>
+              </w:rPr>
+              <w:t>[TBD]</w:t>
+            </w:r>
+          </w:p>
+        </w:tc>
+        <w:tc>
+          <w:tcPr>
+            <w:tcW w:type="dxa" w:w="1142"/>
+          </w:tcPr>
+          <w:p>
+            <w:pPr>
+              <w:keepNext/>
+              <w:spacing w:after="20"/>
+              <w:jc w:val="center"/>
+            </w:pPr>
+            <w:r>
+              <w:rPr>
+                <w:i w:val="0"/>
+                <w:color w:val="C01F1F"/>
+                <w:sz w:val="16"/>
+              </w:rPr>
+              <w:t>[TBD]</w:t>
+            </w:r>
+          </w:p>
+        </w:tc>
+        <w:tc>
+          <w:tcPr>
+            <w:tcW w:type="dxa" w:w="997"/>
+          </w:tcPr>
+          <w:p>
+            <w:pPr>
+              <w:keepNext/>
+              <w:spacing w:after="20"/>
+              <w:jc w:val="center"/>
+            </w:pPr>
+            <w:r>
+              <w:rPr>
+                <w:i w:val="0"/>
+                <w:color w:val="C01F1F"/>
+                <w:sz w:val="16"/>
+              </w:rPr>
+              <w:t>[TBD]</w:t>
+            </w:r>
+          </w:p>
+        </w:tc>
+        <w:tc>
+          <w:tcPr>
+            <w:tcW w:type="dxa" w:w="997"/>
+          </w:tcPr>
+          <w:p>
+            <w:pPr>
+              <w:keepNext/>
+              <w:spacing w:after="20"/>
+              <w:jc w:val="center"/>
+            </w:pPr>
+            <w:r>
+              <w:rPr>
+                <w:i w:val="0"/>
+                <w:color w:val="C01F1F"/>
+                <w:sz w:val="16"/>
+              </w:rPr>
+              <w:t>[TBD]</w:t>
+            </w:r>
+          </w:p>
+        </w:tc>
+      </w:tr>
+      <w:tr>
+        <w:trPr>
+          <w:cantSplit/>
+        </w:trPr>
+        <w:tc>
+          <w:tcPr>
+            <w:tcW w:type="dxa" w:w="969"/>
+          </w:tcPr>
+          <w:p>
+            <w:pPr>
+              <w:keepNext/>
+              <w:spacing w:after="20"/>
+              <w:jc w:val="left"/>
+            </w:pPr>
+          </w:p>
+        </w:tc>
+        <w:tc>
+          <w:tcPr>
+            <w:tcW w:type="dxa" w:w="1976"/>
+          </w:tcPr>
+          <w:p>
+            <w:pPr>
+              <w:keepNext/>
+              <w:spacing w:after="20"/>
+              <w:jc w:val="left"/>
+            </w:pPr>
+            <w:r>
+              <w:rPr>
+                <w:sz w:val="16"/>
+              </w:rPr>
+              <w:t>MuRIL</w:t>
+            </w:r>
+          </w:p>
+        </w:tc>
+        <w:tc>
+          <w:tcPr>
+            <w:tcW w:type="dxa" w:w="997"/>
+          </w:tcPr>
+          <w:p>
+            <w:pPr>
+              <w:keepNext/>
+              <w:spacing w:after="20"/>
+              <w:jc w:val="center"/>
+            </w:pPr>
+            <w:r>
+              <w:rPr>
+                <w:i w:val="0"/>
+                <w:color w:val="C01F1F"/>
+                <w:sz w:val="16"/>
+              </w:rPr>
+              <w:t>[TBD]</w:t>
+            </w:r>
+          </w:p>
+        </w:tc>
+        <w:tc>
+          <w:tcPr>
+            <w:tcW w:type="dxa" w:w="997"/>
+          </w:tcPr>
+          <w:p>
+            <w:pPr>
+              <w:keepNext/>
+              <w:spacing w:after="20"/>
+              <w:jc w:val="center"/>
+            </w:pPr>
+            <w:r>
+              <w:rPr>
+                <w:i w:val="0"/>
+                <w:color w:val="C01F1F"/>
+                <w:sz w:val="16"/>
+              </w:rPr>
+              <w:t>[TBD]</w:t>
+            </w:r>
+          </w:p>
+        </w:tc>
+        <w:tc>
+          <w:tcPr>
+            <w:tcW w:type="dxa" w:w="997"/>
+          </w:tcPr>
+          <w:p>
+            <w:pPr>
+              <w:keepNext/>
+              <w:spacing w:after="20"/>
+              <w:jc w:val="center"/>
+            </w:pPr>
+            <w:r>
+              <w:rPr>
+                <w:i w:val="0"/>
+                <w:color w:val="C01F1F"/>
+                <w:sz w:val="16"/>
+              </w:rPr>
+              <w:t>[TBD]</w:t>
+            </w:r>
+          </w:p>
+        </w:tc>
+        <w:tc>
+          <w:tcPr>
+            <w:tcW w:type="dxa" w:w="1142"/>
+          </w:tcPr>
+          <w:p>
+            <w:pPr>
+              <w:keepNext/>
+              <w:spacing w:after="20"/>
+              <w:jc w:val="center"/>
+            </w:pPr>
+            <w:r>
+              <w:rPr>
+                <w:i w:val="0"/>
+                <w:color w:val="C01F1F"/>
+                <w:sz w:val="16"/>
+              </w:rPr>
+              <w:t>[TBD]</w:t>
+            </w:r>
+          </w:p>
+        </w:tc>
+        <w:tc>
+          <w:tcPr>
+            <w:tcW w:type="dxa" w:w="997"/>
+          </w:tcPr>
+          <w:p>
+            <w:pPr>
+              <w:keepNext/>
+              <w:spacing w:after="20"/>
+              <w:jc w:val="center"/>
+            </w:pPr>
+            <w:r>
+              <w:rPr>
+                <w:i w:val="0"/>
+                <w:color w:val="C01F1F"/>
+                <w:sz w:val="16"/>
+              </w:rPr>
+              <w:t>[TBD]</w:t>
+            </w:r>
+          </w:p>
+        </w:tc>
+        <w:tc>
+          <w:tcPr>
+            <w:tcW w:type="dxa" w:w="997"/>
+          </w:tcPr>
+          <w:p>
+            <w:pPr>
+              <w:keepNext/>
+              <w:spacing w:after="20"/>
+              <w:jc w:val="center"/>
+            </w:pPr>
+            <w:r>
+              <w:rPr>
+                <w:i w:val="0"/>
+                <w:color w:val="C01F1F"/>
+                <w:sz w:val="16"/>
+              </w:rPr>
+              <w:t>[TBD]</w:t>
+            </w:r>
+          </w:p>
+        </w:tc>
+      </w:tr>
+      <w:tr>
+        <w:trPr>
+          <w:cantSplit/>
+        </w:trPr>
+        <w:tc>
+          <w:tcPr>
+            <w:tcW w:type="dxa" w:w="969"/>
             <w:tcBorders>
               <w:top w:val="single" w:sz="4" w:space="0" w:color="000000"/>
               <w:bottom w:val="single" w:sz="12" w:space="0" w:color="000000"/>
@@ -2086,7 +2182,7 @@
         </w:tc>
         <w:tc>
           <w:tcPr>
-            <w:tcW w:type="dxa" w:w="2014"/>
+            <w:tcW w:type="dxa" w:w="1976"/>
             <w:tcBorders>
               <w:top w:val="single" w:sz="4" w:space="0" w:color="000000"/>
               <w:bottom w:val="single" w:sz="12" w:space="0" w:color="000000"/>
@@ -2100,9 +2196,11 @@
             </w:pPr>
             <w:r>
               <w:rPr>
+                <w:i w:val="0"/>
+                <w:color w:val="C01F1F"/>
                 <w:sz w:val="16"/>
               </w:rPr>
-              <w:t>Random forest + TF-IDF + SVM</w:t>
+              <w:t>[TBD]</w:t>
             </w:r>
           </w:p>
         </w:tc>
@@ -2122,9 +2220,11 @@
             </w:pPr>
             <w:r>
               <w:rPr>
+                <w:i w:val="0"/>
+                <w:color w:val="C01F1F"/>
                 <w:sz w:val="16"/>
               </w:rPr>
-              <w:t>0.60 ± 0.17</w:t>
+              <w:t>[TBD]</w:t>
             </w:r>
           </w:p>
         </w:tc>
@@ -2144,9 +2244,35 @@
             </w:pPr>
             <w:r>
               <w:rPr>
+                <w:i w:val="0"/>
+                <w:color w:val="C01F1F"/>
                 <w:sz w:val="16"/>
               </w:rPr>
-              <w:t>0.77 ± 0.12</w:t>
+              <w:t>[TBD]</w:t>
+            </w:r>
+          </w:p>
+        </w:tc>
+        <w:tc>
+          <w:tcPr>
+            <w:tcW w:type="dxa" w:w="997"/>
+            <w:tcBorders>
+              <w:top w:val="single" w:sz="4" w:space="0" w:color="000000"/>
+              <w:bottom w:val="single" w:sz="12" w:space="0" w:color="000000"/>
+            </w:tcBorders>
+          </w:tcPr>
+          <w:p>
+            <w:pPr>
+              <w:keepNext w:val="0"/>
+              <w:spacing w:after="20"/>
+              <w:jc w:val="center"/>
+            </w:pPr>
+            <w:r>
+              <w:rPr>
+                <w:i w:val="0"/>
+                <w:color w:val="C01F1F"/>
+                <w:sz w:val="16"/>
+              </w:rPr>
+              <w:t>[TBD]</w:t>
             </w:r>
           </w:p>
         </w:tc>
@@ -2166,31 +2292,11 @@
             </w:pPr>
             <w:r>
               <w:rPr>
+                <w:i w:val="0"/>
+                <w:color w:val="C01F1F"/>
                 <w:sz w:val="16"/>
               </w:rPr>
-              <w:t>0.43 ± 0.24</w:t>
-            </w:r>
-          </w:p>
-        </w:tc>
-        <w:tc>
-          <w:tcPr>
-            <w:tcW w:type="dxa" w:w="1142"/>
-            <w:tcBorders>
-              <w:top w:val="single" w:sz="4" w:space="0" w:color="000000"/>
-              <w:bottom w:val="single" w:sz="12" w:space="0" w:color="000000"/>
-            </w:tcBorders>
-          </w:tcPr>
-          <w:p>
-            <w:pPr>
-              <w:keepNext w:val="0"/>
-              <w:spacing w:after="20"/>
-              <w:jc w:val="center"/>
-            </w:pPr>
-            <w:r>
-              <w:rPr>
-                <w:sz w:val="16"/>
-              </w:rPr>
-              <w:t>0.47 ± 0.36</w:t>
+              <w:t>[TBD]</w:t>
             </w:r>
           </w:p>
         </w:tc>
@@ -2210,9 +2316,11 @@
             </w:pPr>
             <w:r>
               <w:rPr>
+                <w:i w:val="0"/>
+                <w:color w:val="C01F1F"/>
                 <w:sz w:val="16"/>
               </w:rPr>
-              <w:t>0.31 ± 0.22</w:t>
+              <w:t>[TBD]</w:t>
             </w:r>
           </w:p>
         </w:tc>
@@ -2232,9 +2340,11 @@
             </w:pPr>
             <w:r>
               <w:rPr>
+                <w:i w:val="0"/>
+                <w:color w:val="C01F1F"/>
                 <w:sz w:val="16"/>
               </w:rPr>
-              <w:t>0.31 ± 0.16</w:t>
+              <w:t>[TBD]</w:t>
             </w:r>
           </w:p>
         </w:tc>
@@ -2263,38 +2373,11 @@
         <w:jc w:val="center"/>
       </w:pPr>
       <w:r>
-        <w:drawing>
-          <wp:inline xmlns:a="http://schemas.openxmlformats.org/drawingml/2006/main" xmlns:pic="http://schemas.openxmlformats.org/drawingml/2006/picture">
-            <wp:extent cx="3571200" cy="2805943"/>
-            <wp:docPr id="1" name="Picture 1"/>
-            <wp:cNvGraphicFramePr>
-              <a:graphicFrameLocks noChangeAspect="1"/>
-            </wp:cNvGraphicFramePr>
-            <a:graphic>
-              <a:graphicData uri="http://schemas.openxmlformats.org/drawingml/2006/picture">
-                <pic:pic>
-                  <pic:nvPicPr>
-                    <pic:cNvPr id="0" name="pr_curves_grouped.png"/>
-                    <pic:cNvPicPr/>
-                  </pic:nvPicPr>
-                  <pic:blipFill>
-                    <a:blip r:embed="rId9"/>
-                    <a:stretch>
-                      <a:fillRect/>
-                    </a:stretch>
-                  </pic:blipFill>
-                  <pic:spPr>
-                    <a:xfrm>
-                      <a:off x="0" y="0"/>
-                      <a:ext cx="3571200" cy="2805943"/>
-                    </a:xfrm>
-                    <a:prstGeom prst="rect"/>
-                  </pic:spPr>
-                </pic:pic>
-              </a:graphicData>
-            </a:graphic>
-          </wp:inline>
-        </w:drawing>
+        <w:rPr>
+          <w:i w:val="0"/>
+          <w:color w:val="C01F1F"/>
+        </w:rPr>
+        <w:t>[figure not produced yet: results/figures/pr_curves_grouped.png]</w:t>
       </w:r>
     </w:p>
     <w:p>
@@ -2321,38 +2404,11 @@
         <w:jc w:val="center"/>
       </w:pPr>
       <w:r>
-        <w:drawing>
-          <wp:inline xmlns:a="http://schemas.openxmlformats.org/drawingml/2006/main" xmlns:pic="http://schemas.openxmlformats.org/drawingml/2006/picture">
-            <wp:extent cx="5760000" cy="2700000"/>
-            <wp:docPr id="2" name="Picture 2"/>
-            <wp:cNvGraphicFramePr>
-              <a:graphicFrameLocks noChangeAspect="1"/>
-            </wp:cNvGraphicFramePr>
-            <a:graphic>
-              <a:graphicData uri="http://schemas.openxmlformats.org/drawingml/2006/picture">
-                <pic:pic>
-                  <pic:nvPicPr>
-                    <pic:cNvPr id="0" name="confusion_grouped.png"/>
-                    <pic:cNvPicPr/>
-                  </pic:nvPicPr>
-                  <pic:blipFill>
-                    <a:blip r:embed="rId10"/>
-                    <a:stretch>
-                      <a:fillRect/>
-                    </a:stretch>
-                  </pic:blipFill>
-                  <pic:spPr>
-                    <a:xfrm>
-                      <a:off x="0" y="0"/>
-                      <a:ext cx="5760000" cy="2700000"/>
-                    </a:xfrm>
-                    <a:prstGeom prst="rect"/>
-                  </pic:spPr>
-                </pic:pic>
-              </a:graphicData>
-            </a:graphic>
-          </wp:inline>
-        </w:drawing>
+        <w:rPr>
+          <w:i w:val="0"/>
+          <w:color w:val="C01F1F"/>
+        </w:rPr>
+        <w:t>[figure not produced yet: results/figures/confusion_grouped.png]</w:t>
       </w:r>
     </w:p>
     <w:p>
@@ -2390,48 +2446,66 @@
         <w:t xml:space="preserve">To test whether models trained on older apps flag newly released ones, we trained on apps released before </w:t>
       </w:r>
       <w:r>
-        <w:rPr/>
-        <w:t>2025-11-20</w:t>
+        <w:rPr>
+          <w:i w:val="0"/>
+          <w:color w:val="C01F1F"/>
+        </w:rPr>
+        <w:t>[temporal.cutoff]</w:t>
       </w:r>
       <w:r>
         <w:rPr/>
         <w:t xml:space="preserve"> (</w:t>
       </w:r>
       <w:r>
-        <w:rPr/>
-        <w:t>278</w:t>
+        <w:rPr>
+          <w:i w:val="0"/>
+          <w:color w:val="C01F1F"/>
+        </w:rPr>
+        <w:t>[temporal.n_train]</w:t>
       </w:r>
       <w:r>
         <w:rPr/>
         <w:t xml:space="preserve"> apps, </w:t>
       </w:r>
       <w:r>
-        <w:rPr/>
-        <w:t>12</w:t>
+        <w:rPr>
+          <w:i w:val="0"/>
+          <w:color w:val="C01F1F"/>
+        </w:rPr>
+        <w:t>[temporal.n_train_pos]</w:t>
       </w:r>
       <w:r>
         <w:rPr/>
         <w:t xml:space="preserve"> unverified) and tested on later releases (</w:t>
       </w:r>
       <w:r>
-        <w:rPr/>
-        <w:t>33</w:t>
+        <w:rPr>
+          <w:i w:val="0"/>
+          <w:color w:val="C01F1F"/>
+        </w:rPr>
+        <w:t>[temporal.n_test]</w:t>
       </w:r>
       <w:r>
         <w:rPr/>
         <w:t xml:space="preserve"> organic apps, </w:t>
       </w:r>
       <w:r>
-        <w:rPr/>
-        <w:t>15</w:t>
+        <w:rPr>
+          <w:i w:val="0"/>
+          <w:color w:val="C01F1F"/>
+        </w:rPr>
+        <w:t>[temporal.n_test_pos]</w:t>
       </w:r>
       <w:r>
         <w:rPr/>
         <w:t xml:space="preserve"> unverified; base rate </w:t>
       </w:r>
       <w:r>
-        <w:rPr/>
-        <w:t>0.455</w:t>
+        <w:rPr>
+          <w:i w:val="0"/>
+          <w:color w:val="C01F1F"/>
+        </w:rPr>
+        <w:t>[temporal.base_rate]</w:t>
       </w:r>
       <w:r>
         <w:rPr/>
@@ -2464,8 +2538,11 @@
         <w:t xml:space="preserve">Temporal hold-out on organic apps released on or after </w:t>
       </w:r>
       <w:r>
-        <w:rPr/>
-        <w:t>2025-11-20</w:t>
+        <w:rPr>
+          <w:i w:val="0"/>
+          <w:color w:val="C01F1F"/>
+        </w:rPr>
+        <w:t>[temporal.cutoff]</w:t>
       </w:r>
       <w:r>
         <w:rPr/>
@@ -2492,7 +2569,7 @@
         </w:trPr>
         <w:tc>
           <w:tcPr>
-            <w:tcW w:type="dxa" w:w="5880"/>
+            <w:tcW w:type="dxa" w:w="1096"/>
             <w:tcBorders>
               <w:top w:val="single" w:sz="12" w:space="0" w:color="000000"/>
               <w:bottom w:val="single" w:sz="6" w:space="0" w:color="000000"/>
@@ -2515,7 +2592,7 @@
         </w:tc>
         <w:tc>
           <w:tcPr>
-            <w:tcW w:type="dxa" w:w="906"/>
+            <w:tcW w:type="dxa" w:w="1096"/>
             <w:tcBorders>
               <w:top w:val="single" w:sz="12" w:space="0" w:color="000000"/>
               <w:bottom w:val="single" w:sz="6" w:space="0" w:color="000000"/>
@@ -2538,7 +2615,7 @@
         </w:tc>
         <w:tc>
           <w:tcPr>
-            <w:tcW w:type="dxa" w:w="1024"/>
+            <w:tcW w:type="dxa" w:w="1096"/>
             <w:tcBorders>
               <w:top w:val="single" w:sz="12" w:space="0" w:color="000000"/>
               <w:bottom w:val="single" w:sz="6" w:space="0" w:color="000000"/>
@@ -2561,7 +2638,7 @@
         </w:tc>
         <w:tc>
           <w:tcPr>
-            <w:tcW w:type="dxa" w:w="1260"/>
+            <w:tcW w:type="dxa" w:w="1096"/>
             <w:tcBorders>
               <w:top w:val="single" w:sz="12" w:space="0" w:color="000000"/>
               <w:bottom w:val="single" w:sz="6" w:space="0" w:color="000000"/>
@@ -2578,7 +2655,7 @@
                 <w:b/>
                 <w:sz w:val="18"/>
               </w:rPr>
-              <w:t>Rec@5%FPR</w:t>
+              <w:t>Rec@5% FPR</w:t>
             </w:r>
           </w:p>
         </w:tc>
@@ -2589,7 +2666,7 @@
         </w:trPr>
         <w:tc>
           <w:tcPr>
-            <w:tcW w:type="dxa" w:w="5880"/>
+            <w:tcW w:type="dxa" w:w="1096"/>
           </w:tcPr>
           <w:p>
             <w:pPr>
@@ -2599,15 +2676,17 @@
             </w:pPr>
             <w:r>
               <w:rPr>
+                <w:i w:val="0"/>
+                <w:color w:val="C01F1F"/>
                 <w:sz w:val="18"/>
               </w:rPr>
-              <w:t>Random forest</w:t>
+              <w:t>[TBD]</w:t>
             </w:r>
           </w:p>
         </w:tc>
         <w:tc>
           <w:tcPr>
-            <w:tcW w:type="dxa" w:w="906"/>
+            <w:tcW w:type="dxa" w:w="1096"/>
           </w:tcPr>
           <w:p>
             <w:pPr>
@@ -2617,15 +2696,17 @@
             </w:pPr>
             <w:r>
               <w:rPr>
+                <w:i w:val="0"/>
+                <w:color w:val="C01F1F"/>
                 <w:sz w:val="18"/>
               </w:rPr>
-              <w:t>0.45</w:t>
+              <w:t>[TBD]</w:t>
             </w:r>
           </w:p>
         </w:tc>
         <w:tc>
           <w:tcPr>
-            <w:tcW w:type="dxa" w:w="1024"/>
+            <w:tcW w:type="dxa" w:w="1096"/>
           </w:tcPr>
           <w:p>
             <w:pPr>
@@ -2635,15 +2716,17 @@
             </w:pPr>
             <w:r>
               <w:rPr>
+                <w:i w:val="0"/>
+                <w:color w:val="C01F1F"/>
                 <w:sz w:val="18"/>
               </w:rPr>
-              <w:t>0.45</w:t>
+              <w:t>[TBD]</w:t>
             </w:r>
           </w:p>
         </w:tc>
         <w:tc>
           <w:tcPr>
-            <w:tcW w:type="dxa" w:w="1260"/>
+            <w:tcW w:type="dxa" w:w="1096"/>
           </w:tcPr>
           <w:p>
             <w:pPr>
@@ -2653,9 +2736,11 @@
             </w:pPr>
             <w:r>
               <w:rPr>
+                <w:i w:val="0"/>
+                <w:color w:val="C01F1F"/>
                 <w:sz w:val="18"/>
               </w:rPr>
-              <w:t>0.00</w:t>
+              <w:t>[TBD]</w:t>
             </w:r>
           </w:p>
         </w:tc>
@@ -2666,7 +2751,7 @@
         </w:trPr>
         <w:tc>
           <w:tcPr>
-            <w:tcW w:type="dxa" w:w="5880"/>
+            <w:tcW w:type="dxa" w:w="1096"/>
           </w:tcPr>
           <w:p>
             <w:pPr>
@@ -2676,15 +2761,17 @@
             </w:pPr>
             <w:r>
               <w:rPr>
+                <w:i w:val="0"/>
+                <w:color w:val="C01F1F"/>
                 <w:sz w:val="18"/>
               </w:rPr>
-              <w:t>LightGBM</w:t>
+              <w:t>[TBD]</w:t>
             </w:r>
           </w:p>
         </w:tc>
         <w:tc>
           <w:tcPr>
-            <w:tcW w:type="dxa" w:w="906"/>
+            <w:tcW w:type="dxa" w:w="1096"/>
           </w:tcPr>
           <w:p>
             <w:pPr>
@@ -2694,15 +2781,17 @@
             </w:pPr>
             <w:r>
               <w:rPr>
+                <w:i w:val="0"/>
+                <w:color w:val="C01F1F"/>
                 <w:sz w:val="18"/>
               </w:rPr>
-              <w:t>0.43</w:t>
+              <w:t>[TBD]</w:t>
             </w:r>
           </w:p>
         </w:tc>
         <w:tc>
           <w:tcPr>
-            <w:tcW w:type="dxa" w:w="1024"/>
+            <w:tcW w:type="dxa" w:w="1096"/>
           </w:tcPr>
           <w:p>
             <w:pPr>
@@ -2712,15 +2801,17 @@
             </w:pPr>
             <w:r>
               <w:rPr>
+                <w:i w:val="0"/>
+                <w:color w:val="C01F1F"/>
                 <w:sz w:val="18"/>
               </w:rPr>
-              <w:t>0.37</w:t>
+              <w:t>[TBD]</w:t>
             </w:r>
           </w:p>
         </w:tc>
         <w:tc>
           <w:tcPr>
-            <w:tcW w:type="dxa" w:w="1260"/>
+            <w:tcW w:type="dxa" w:w="1096"/>
           </w:tcPr>
           <w:p>
             <w:pPr>
@@ -2730,9 +2821,11 @@
             </w:pPr>
             <w:r>
               <w:rPr>
+                <w:i w:val="0"/>
+                <w:color w:val="C01F1F"/>
                 <w:sz w:val="18"/>
               </w:rPr>
-              <w:t>0.07</w:t>
+              <w:t>[TBD]</w:t>
             </w:r>
           </w:p>
         </w:tc>
@@ -2743,7 +2836,7 @@
         </w:trPr>
         <w:tc>
           <w:tcPr>
-            <w:tcW w:type="dxa" w:w="5880"/>
+            <w:tcW w:type="dxa" w:w="1096"/>
             <w:tcBorders>
               <w:bottom w:val="single" w:sz="12" w:space="0" w:color="000000"/>
             </w:tcBorders>
@@ -2756,15 +2849,17 @@
             </w:pPr>
             <w:r>
               <w:rPr>
+                <w:i w:val="0"/>
+                <w:color w:val="C01F1F"/>
                 <w:sz w:val="18"/>
               </w:rPr>
-              <w:t>Logistic regression</w:t>
+              <w:t>[TBD]</w:t>
             </w:r>
           </w:p>
         </w:tc>
         <w:tc>
           <w:tcPr>
-            <w:tcW w:type="dxa" w:w="906"/>
+            <w:tcW w:type="dxa" w:w="1096"/>
             <w:tcBorders>
               <w:bottom w:val="single" w:sz="12" w:space="0" w:color="000000"/>
             </w:tcBorders>
@@ -2777,15 +2872,17 @@
             </w:pPr>
             <w:r>
               <w:rPr>
+                <w:i w:val="0"/>
+                <w:color w:val="C01F1F"/>
                 <w:sz w:val="18"/>
               </w:rPr>
-              <w:t>0.56</w:t>
+              <w:t>[TBD]</w:t>
             </w:r>
           </w:p>
         </w:tc>
         <w:tc>
           <w:tcPr>
-            <w:tcW w:type="dxa" w:w="1024"/>
+            <w:tcW w:type="dxa" w:w="1096"/>
             <w:tcBorders>
               <w:bottom w:val="single" w:sz="12" w:space="0" w:color="000000"/>
             </w:tcBorders>
@@ -2798,15 +2895,17 @@
             </w:pPr>
             <w:r>
               <w:rPr>
+                <w:i w:val="0"/>
+                <w:color w:val="C01F1F"/>
                 <w:sz w:val="18"/>
               </w:rPr>
-              <w:t>0.47</w:t>
+              <w:t>[TBD]</w:t>
             </w:r>
           </w:p>
         </w:tc>
         <w:tc>
           <w:tcPr>
-            <w:tcW w:type="dxa" w:w="1260"/>
+            <w:tcW w:type="dxa" w:w="1096"/>
             <w:tcBorders>
               <w:bottom w:val="single" w:sz="12" w:space="0" w:color="000000"/>
             </w:tcBorders>
@@ -2819,9 +2918,11 @@
             </w:pPr>
             <w:r>
               <w:rPr>
+                <w:i w:val="0"/>
+                <w:color w:val="C01F1F"/>
                 <w:sz w:val="18"/>
               </w:rPr>
-              <w:t>0.20</w:t>
+              <w:t>[TBD]</w:t>
             </w:r>
           </w:p>
         </w:tc>
@@ -2861,56 +2962,77 @@
         <w:t xml:space="preserve">Removing one feature group at a time from </w:t>
       </w:r>
       <w:r>
-        <w:rPr/>
-        <w:t>Random forest</w:t>
+        <w:rPr>
+          <w:i w:val="0"/>
+          <w:color w:val="C01F1F"/>
+        </w:rPr>
+        <w:t>[ablation.model]</w:t>
       </w:r>
       <w:r>
         <w:rPr/>
         <w:t xml:space="preserve"> (full model PR-AUC </w:t>
       </w:r>
       <w:r>
-        <w:rPr/>
-        <w:t>0.62</w:t>
+        <w:rPr>
+          <w:i w:val="0"/>
+          <w:color w:val="C01F1F"/>
+        </w:rPr>
+        <w:t>[ablation.full]</w:t>
       </w:r>
       <w:r>
         <w:rPr/>
         <w:t xml:space="preserve">) changed PR-AUC by </w:t>
       </w:r>
       <w:r>
-        <w:rPr/>
-        <w:t>−0.031</w:t>
+        <w:rPr>
+          <w:i w:val="0"/>
+          <w:color w:val="C01F1F"/>
+        </w:rPr>
+        <w:t>[ablation.metadata]</w:t>
       </w:r>
       <w:r>
         <w:rPr/>
         <w:t xml:space="preserve"> (metadata), </w:t>
       </w:r>
       <w:r>
-        <w:rPr/>
-        <w:t>+0.017</w:t>
+        <w:rPr>
+          <w:i w:val="0"/>
+          <w:color w:val="C01F1F"/>
+        </w:rPr>
+        <w:t>[ablation.developer]</w:t>
       </w:r>
       <w:r>
         <w:rPr/>
         <w:t xml:space="preserve"> (developer), </w:t>
       </w:r>
       <w:r>
-        <w:rPr/>
-        <w:t>+0.004</w:t>
+        <w:rPr>
+          <w:i w:val="0"/>
+          <w:color w:val="C01F1F"/>
+        </w:rPr>
+        <w:t>[ablation.permissions]</w:t>
       </w:r>
       <w:r>
         <w:rPr/>
         <w:t xml:space="preserve"> (permissions), </w:t>
       </w:r>
       <w:r>
-        <w:rPr/>
-        <w:t>−0.091</w:t>
+        <w:rPr>
+          <w:i w:val="0"/>
+          <w:color w:val="C01F1F"/>
+        </w:rPr>
+        <w:t>[ablation.listing_text]</w:t>
       </w:r>
       <w:r>
         <w:rPr/>
         <w:t xml:space="preserve"> (listing text) and </w:t>
       </w:r>
       <w:r>
-        <w:rPr/>
-        <w:t>+0.002</w:t>
+        <w:rPr>
+          <w:i w:val="0"/>
+          <w:color w:val="C01F1F"/>
+        </w:rPr>
+        <w:t>[ablation.review_text]</w:t>
       </w:r>
       <w:r>
         <w:rPr/>
@@ -2925,8 +3047,11 @@
         <w:t xml:space="preserve">). The largest drop came from removing </w:t>
       </w:r>
       <w:r>
-        <w:rPr/>
-        <w:t>listing text</w:t>
+        <w:rPr>
+          <w:i w:val="0"/>
+          <w:color w:val="C01F1F"/>
+        </w:rPr>
+        <w:t>[ablation.most_important]</w:t>
       </w:r>
       <w:r>
         <w:rPr/>
@@ -2939,38 +3064,11 @@
         <w:jc w:val="center"/>
       </w:pPr>
       <w:r>
-        <w:drawing>
-          <wp:inline xmlns:a="http://schemas.openxmlformats.org/drawingml/2006/main" xmlns:pic="http://schemas.openxmlformats.org/drawingml/2006/picture">
-            <wp:extent cx="4320000" cy="2221714"/>
-            <wp:docPr id="3" name="Picture 3"/>
-            <wp:cNvGraphicFramePr>
-              <a:graphicFrameLocks noChangeAspect="1"/>
-            </wp:cNvGraphicFramePr>
-            <a:graphic>
-              <a:graphicData uri="http://schemas.openxmlformats.org/drawingml/2006/picture">
-                <pic:pic>
-                  <pic:nvPicPr>
-                    <pic:cNvPr id="0" name="ablation.png"/>
-                    <pic:cNvPicPr/>
-                  </pic:nvPicPr>
-                  <pic:blipFill>
-                    <a:blip r:embed="rId11"/>
-                    <a:stretch>
-                      <a:fillRect/>
-                    </a:stretch>
-                  </pic:blipFill>
-                  <pic:spPr>
-                    <a:xfrm>
-                      <a:off x="0" y="0"/>
-                      <a:ext cx="4320000" cy="2221714"/>
-                    </a:xfrm>
-                    <a:prstGeom prst="rect"/>
-                  </pic:spPr>
-                </pic:pic>
-              </a:graphicData>
-            </a:graphic>
-          </wp:inline>
-        </w:drawing>
+        <w:rPr>
+          <w:i w:val="0"/>
+          <w:color w:val="C01F1F"/>
+        </w:rPr>
+        <w:t>[figure not produced yet: results/figures/ablation.png]</w:t>
       </w:r>
     </w:p>
     <w:p>
@@ -3008,48 +3106,66 @@
         <w:t xml:space="preserve">Using only information available in an app's first 14 days (no install counts, ratings or age, and reviews from the first two weeks only), </w:t>
       </w:r>
       <w:r>
-        <w:rPr/>
-        <w:t>Random forest</w:t>
+        <w:rPr>
+          <w:i w:val="0"/>
+          <w:color w:val="C01F1F"/>
+        </w:rPr>
+        <w:t>[early.model]</w:t>
       </w:r>
       <w:r>
         <w:rPr/>
         <w:t xml:space="preserve"> reached a PR-AUC of </w:t>
       </w:r>
       <w:r>
-        <w:rPr/>
-        <w:t>0.70 ± 0.10</w:t>
+        <w:rPr>
+          <w:i w:val="0"/>
+          <w:color w:val="C01F1F"/>
+        </w:rPr>
+        <w:t>[early.early14.pr_auc]</w:t>
       </w:r>
       <w:r>
         <w:rPr/>
         <w:t xml:space="preserve"> (ROC-AUC </w:t>
       </w:r>
       <w:r>
-        <w:rPr/>
-        <w:t>0.83 ± 0.08</w:t>
+        <w:rPr>
+          <w:i w:val="0"/>
+          <w:color w:val="C01F1F"/>
+        </w:rPr>
+        <w:t>[early.early14.roc_auc]</w:t>
       </w:r>
       <w:r>
         <w:rPr/>
         <w:t xml:space="preserve">), against </w:t>
       </w:r>
       <w:r>
-        <w:rPr/>
-        <w:t>0.62 ± 0.18</w:t>
+        <w:rPr>
+          <w:i w:val="0"/>
+          <w:color w:val="C01F1F"/>
+        </w:rPr>
+        <w:t>[early.full.pr_auc]</w:t>
       </w:r>
       <w:r>
         <w:rPr/>
         <w:t xml:space="preserve"> (ROC-AUC </w:t>
       </w:r>
       <w:r>
-        <w:rPr/>
-        <w:t>0.79 ± 0.15</w:t>
+        <w:rPr>
+          <w:i w:val="0"/>
+          <w:color w:val="C01F1F"/>
+        </w:rPr>
+        <w:t>[early.full.roc_auc]</w:t>
       </w:r>
       <w:r>
         <w:rPr/>
         <w:t xml:space="preserve">) with full snapshot features. Only </w:t>
       </w:r>
       <w:r>
-        <w:rPr/>
-        <w:t>26</w:t>
+        <w:rPr>
+          <w:i w:val="0"/>
+          <w:color w:val="C01F1F"/>
+        </w:rPr>
+        <w:t>[early.n_with_reviews]</w:t>
       </w:r>
       <w:r>
         <w:rPr/>
@@ -3129,7 +3245,7 @@
         </w:trPr>
         <w:tc>
           <w:tcPr>
-            <w:tcW w:type="dxa" w:w="4078"/>
+            <w:tcW w:type="dxa" w:w="3589"/>
             <w:tcBorders>
               <w:top w:val="single" w:sz="12" w:space="0" w:color="000000"/>
               <w:bottom w:val="single" w:sz="6" w:space="0" w:color="000000"/>
@@ -3244,7 +3360,7 @@
         </w:tc>
         <w:tc>
           <w:tcPr>
-            <w:tcW w:type="dxa" w:w="607"/>
+            <w:tcW w:type="dxa" w:w="1096"/>
             <w:tcBorders>
               <w:top w:val="single" w:sz="12" w:space="0" w:color="000000"/>
               <w:bottom w:val="single" w:sz="6" w:space="0" w:color="000000"/>
@@ -3272,7 +3388,7 @@
         </w:trPr>
         <w:tc>
           <w:tcPr>
-            <w:tcW w:type="dxa" w:w="4078"/>
+            <w:tcW w:type="dxa" w:w="3589"/>
           </w:tcPr>
           <w:p>
             <w:pPr>
@@ -3300,9 +3416,11 @@
             </w:pPr>
             <w:r>
               <w:rPr>
+                <w:i w:val="0"/>
+                <w:color w:val="C01F1F"/>
                 <w:sz w:val="18"/>
               </w:rPr>
-              <w:t>0.58 ± 0.17</w:t>
+              <w:t>[TBD]</w:t>
             </w:r>
           </w:p>
         </w:tc>
@@ -3318,9 +3436,11 @@
             </w:pPr>
             <w:r>
               <w:rPr>
+                <w:i w:val="0"/>
+                <w:color w:val="C01F1F"/>
                 <w:sz w:val="18"/>
               </w:rPr>
-              <w:t>0.54 ± 0.17</w:t>
+              <w:t>[TBD]</w:t>
             </w:r>
           </w:p>
         </w:tc>
@@ -3336,9 +3456,11 @@
             </w:pPr>
             <w:r>
               <w:rPr>
+                <w:i w:val="0"/>
+                <w:color w:val="C01F1F"/>
                 <w:sz w:val="18"/>
               </w:rPr>
-              <w:t>0.58 ± 0.17</w:t>
+              <w:t>[TBD]</w:t>
             </w:r>
           </w:p>
         </w:tc>
@@ -3354,15 +3476,17 @@
             </w:pPr>
             <w:r>
               <w:rPr>
+                <w:i w:val="0"/>
+                <w:color w:val="C01F1F"/>
                 <w:sz w:val="18"/>
               </w:rPr>
-              <w:t>0.55 ± 0.12</w:t>
+              <w:t>[TBD]</w:t>
             </w:r>
           </w:p>
         </w:tc>
         <w:tc>
           <w:tcPr>
-            <w:tcW w:type="dxa" w:w="607"/>
+            <w:tcW w:type="dxa" w:w="1096"/>
           </w:tcPr>
           <w:p>
             <w:pPr>
@@ -3372,9 +3496,11 @@
             </w:pPr>
             <w:r>
               <w:rPr>
+                <w:i w:val="0"/>
+                <w:color w:val="C01F1F"/>
                 <w:sz w:val="18"/>
               </w:rPr>
-              <w:t>−0.02</w:t>
+              <w:t>[TBD]</w:t>
             </w:r>
           </w:p>
         </w:tc>
@@ -3385,7 +3511,7 @@
         </w:trPr>
         <w:tc>
           <w:tcPr>
-            <w:tcW w:type="dxa" w:w="4078"/>
+            <w:tcW w:type="dxa" w:w="3589"/>
           </w:tcPr>
           <w:p>
             <w:pPr>
@@ -3413,9 +3539,11 @@
             </w:pPr>
             <w:r>
               <w:rPr>
+                <w:i w:val="0"/>
+                <w:color w:val="C01F1F"/>
                 <w:sz w:val="18"/>
               </w:rPr>
-              <w:t>0.62 ± 0.18</w:t>
+              <w:t>[TBD]</w:t>
             </w:r>
           </w:p>
         </w:tc>
@@ -3431,9 +3559,11 @@
             </w:pPr>
             <w:r>
               <w:rPr>
+                <w:i w:val="0"/>
+                <w:color w:val="C01F1F"/>
                 <w:sz w:val="18"/>
               </w:rPr>
-              <w:t>0.63 ± 0.18</w:t>
+              <w:t>[TBD]</w:t>
             </w:r>
           </w:p>
         </w:tc>
@@ -3449,9 +3579,11 @@
             </w:pPr>
             <w:r>
               <w:rPr>
+                <w:i w:val="0"/>
+                <w:color w:val="C01F1F"/>
                 <w:sz w:val="18"/>
               </w:rPr>
-              <w:t>0.62 ± 0.18</w:t>
+              <w:t>[TBD]</w:t>
             </w:r>
           </w:p>
         </w:tc>
@@ -3467,15 +3599,17 @@
             </w:pPr>
             <w:r>
               <w:rPr>
+                <w:i w:val="0"/>
+                <w:color w:val="C01F1F"/>
                 <w:sz w:val="18"/>
               </w:rPr>
-              <w:t>0.62 ± 0.11</w:t>
+              <w:t>[TBD]</w:t>
             </w:r>
           </w:p>
         </w:tc>
         <w:tc>
           <w:tcPr>
-            <w:tcW w:type="dxa" w:w="607"/>
+            <w:tcW w:type="dxa" w:w="1096"/>
           </w:tcPr>
           <w:p>
             <w:pPr>
@@ -3485,9 +3619,11 @@
             </w:pPr>
             <w:r>
               <w:rPr>
+                <w:i w:val="0"/>
+                <w:color w:val="C01F1F"/>
                 <w:sz w:val="18"/>
               </w:rPr>
-              <w:t>0.00</w:t>
+              <w:t>[TBD]</w:t>
             </w:r>
           </w:p>
         </w:tc>
@@ -3498,7 +3634,7 @@
         </w:trPr>
         <w:tc>
           <w:tcPr>
-            <w:tcW w:type="dxa" w:w="4078"/>
+            <w:tcW w:type="dxa" w:w="3589"/>
           </w:tcPr>
           <w:p>
             <w:pPr>
@@ -3526,9 +3662,11 @@
             </w:pPr>
             <w:r>
               <w:rPr>
+                <w:i w:val="0"/>
+                <w:color w:val="C01F1F"/>
                 <w:sz w:val="18"/>
               </w:rPr>
-              <w:t>0.54 ± 0.16</w:t>
+              <w:t>[TBD]</w:t>
             </w:r>
           </w:p>
         </w:tc>
@@ -3544,9 +3682,11 @@
             </w:pPr>
             <w:r>
               <w:rPr>
+                <w:i w:val="0"/>
+                <w:color w:val="C01F1F"/>
                 <w:sz w:val="18"/>
               </w:rPr>
-              <w:t>0.61 ± 0.17</w:t>
+              <w:t>[TBD]</w:t>
             </w:r>
           </w:p>
         </w:tc>
@@ -3562,9 +3702,11 @@
             </w:pPr>
             <w:r>
               <w:rPr>
+                <w:i w:val="0"/>
+                <w:color w:val="C01F1F"/>
                 <w:sz w:val="18"/>
               </w:rPr>
-              <w:t>0.54 ± 0.16</w:t>
+              <w:t>[TBD]</w:t>
             </w:r>
           </w:p>
         </w:tc>
@@ -3580,15 +3722,17 @@
             </w:pPr>
             <w:r>
               <w:rPr>
+                <w:i w:val="0"/>
+                <w:color w:val="C01F1F"/>
                 <w:sz w:val="18"/>
               </w:rPr>
-              <w:t>0.47 ± 0.10</w:t>
+              <w:t>[TBD]</w:t>
             </w:r>
           </w:p>
         </w:tc>
         <w:tc>
           <w:tcPr>
-            <w:tcW w:type="dxa" w:w="607"/>
+            <w:tcW w:type="dxa" w:w="1096"/>
           </w:tcPr>
           <w:p>
             <w:pPr>
@@ -3598,9 +3742,11 @@
             </w:pPr>
             <w:r>
               <w:rPr>
+                <w:i w:val="0"/>
+                <w:color w:val="C01F1F"/>
                 <w:sz w:val="18"/>
               </w:rPr>
-              <w:t>−0.07</w:t>
+              <w:t>[TBD]</w:t>
             </w:r>
           </w:p>
         </w:tc>
@@ -3611,7 +3757,7 @@
         </w:trPr>
         <w:tc>
           <w:tcPr>
-            <w:tcW w:type="dxa" w:w="4078"/>
+            <w:tcW w:type="dxa" w:w="3589"/>
             <w:tcBorders>
               <w:bottom w:val="single" w:sz="12" w:space="0" w:color="000000"/>
             </w:tcBorders>
@@ -3645,9 +3791,11 @@
             </w:pPr>
             <w:r>
               <w:rPr>
+                <w:i w:val="0"/>
+                <w:color w:val="C01F1F"/>
                 <w:sz w:val="18"/>
               </w:rPr>
-              <w:t>0.59 ± 0.19</w:t>
+              <w:t>[TBD]</w:t>
             </w:r>
           </w:p>
         </w:tc>
@@ -3666,9 +3814,11 @@
             </w:pPr>
             <w:r>
               <w:rPr>
+                <w:i w:val="0"/>
+                <w:color w:val="C01F1F"/>
                 <w:sz w:val="18"/>
               </w:rPr>
-              <w:t>0.61 ± 0.19</w:t>
+              <w:t>[TBD]</w:t>
             </w:r>
           </w:p>
         </w:tc>
@@ -3687,9 +3837,11 @@
             </w:pPr>
             <w:r>
               <w:rPr>
+                <w:i w:val="0"/>
+                <w:color w:val="C01F1F"/>
                 <w:sz w:val="18"/>
               </w:rPr>
-              <w:t>0.59 ± 0.19</w:t>
+              <w:t>[TBD]</w:t>
             </w:r>
           </w:p>
         </w:tc>
@@ -3708,15 +3860,17 @@
             </w:pPr>
             <w:r>
               <w:rPr>
+                <w:i w:val="0"/>
+                <w:color w:val="C01F1F"/>
                 <w:sz w:val="18"/>
               </w:rPr>
-              <w:t>0.53 ± 0.19</w:t>
+              <w:t>[TBD]</w:t>
             </w:r>
           </w:p>
         </w:tc>
         <w:tc>
           <w:tcPr>
-            <w:tcW w:type="dxa" w:w="607"/>
+            <w:tcW w:type="dxa" w:w="1096"/>
             <w:tcBorders>
               <w:bottom w:val="single" w:sz="12" w:space="0" w:color="000000"/>
             </w:tcBorders>
@@ -3729,9 +3883,11 @@
             </w:pPr>
             <w:r>
               <w:rPr>
+                <w:i w:val="0"/>
+                <w:color w:val="C01F1F"/>
                 <w:sz w:val="18"/>
               </w:rPr>
-              <w:t>−0.06</w:t>
+              <w:t>[TBD]</w:t>
             </w:r>
           </w:p>
         </w:tc>
@@ -3775,56 +3931,77 @@
         <w:t xml:space="preserve"> shows SHAP values for </w:t>
       </w:r>
       <w:r>
-        <w:rPr/>
-        <w:t>Random forest</w:t>
+        <w:rPr>
+          <w:i w:val="0"/>
+          <w:color w:val="C01F1F"/>
+        </w:rPr>
+        <w:t>[shap.model]</w:t>
       </w:r>
       <w:r>
         <w:rPr/>
         <w:t xml:space="preserve"> fitted on all </w:t>
       </w:r>
       <w:r>
-        <w:rPr/>
-        <w:t>378</w:t>
+        <w:rPr>
+          <w:i w:val="0"/>
+          <w:color w:val="C01F1F"/>
+        </w:rPr>
+        <w:t>[shap.n_apps]</w:t>
       </w:r>
       <w:r>
         <w:rPr/>
         <w:t xml:space="preserve"> labelled apps. The five most influential features were </w:t>
       </w:r>
       <w:r>
-        <w:rPr/>
-        <w:t>app age (days)</w:t>
+        <w:rPr>
+          <w:i w:val="0"/>
+          <w:color w:val="C01F1F"/>
+        </w:rPr>
+        <w:t>[shap.top1]</w:t>
       </w:r>
       <w:r>
         <w:rPr/>
         <w:t xml:space="preserve">, </w:t>
       </w:r>
       <w:r>
-        <w:rPr/>
-        <w:t>names a lending partner</w:t>
+        <w:rPr>
+          <w:i w:val="0"/>
+          <w:color w:val="C01F1F"/>
+        </w:rPr>
+        <w:t>[shap.top2]</w:t>
       </w:r>
       <w:r>
         <w:rPr/>
         <w:t xml:space="preserve">, </w:t>
       </w:r>
       <w:r>
-        <w:rPr/>
-        <w:t>number of ratings (log)</w:t>
+        <w:rPr>
+          <w:i w:val="0"/>
+          <w:color w:val="C01F1F"/>
+        </w:rPr>
+        <w:t>[shap.top3]</w:t>
       </w:r>
       <w:r>
         <w:rPr/>
         <w:t xml:space="preserve">, </w:t>
       </w:r>
       <w:r>
-        <w:rPr/>
-        <w:t>states tenure</w:t>
+        <w:rPr>
+          <w:i w:val="0"/>
+          <w:color w:val="C01F1F"/>
+        </w:rPr>
+        <w:t>[shap.top4]</w:t>
       </w:r>
       <w:r>
         <w:rPr/>
         <w:t xml:space="preserve"> and </w:t>
       </w:r>
       <w:r>
-        <w:rPr/>
-        <w:t>description length (log)</w:t>
+        <w:rPr>
+          <w:i w:val="0"/>
+          <w:color w:val="C01F1F"/>
+        </w:rPr>
+        <w:t>[shap.top5]</w:t>
       </w:r>
       <w:r>
         <w:rPr/>
@@ -3837,38 +4014,11 @@
         <w:jc w:val="center"/>
       </w:pPr>
       <w:r>
-        <w:drawing>
-          <wp:inline xmlns:a="http://schemas.openxmlformats.org/drawingml/2006/main" xmlns:pic="http://schemas.openxmlformats.org/drawingml/2006/picture">
-            <wp:extent cx="4031999" cy="3691655"/>
-            <wp:docPr id="4" name="Picture 4"/>
-            <wp:cNvGraphicFramePr>
-              <a:graphicFrameLocks noChangeAspect="1"/>
-            </wp:cNvGraphicFramePr>
-            <a:graphic>
-              <a:graphicData uri="http://schemas.openxmlformats.org/drawingml/2006/picture">
-                <pic:pic>
-                  <pic:nvPicPr>
-                    <pic:cNvPr id="0" name="shap_summary_beeswarm.png"/>
-                    <pic:cNvPicPr/>
-                  </pic:nvPicPr>
-                  <pic:blipFill>
-                    <a:blip r:embed="rId12"/>
-                    <a:stretch>
-                      <a:fillRect/>
-                    </a:stretch>
-                  </pic:blipFill>
-                  <pic:spPr>
-                    <a:xfrm>
-                      <a:off x="0" y="0"/>
-                      <a:ext cx="4031999" cy="3691655"/>
-                    </a:xfrm>
-                    <a:prstGeom prst="rect"/>
-                  </pic:spPr>
-                </pic:pic>
-              </a:graphicData>
-            </a:graphic>
-          </wp:inline>
-        </w:drawing>
+        <w:rPr>
+          <w:i w:val="0"/>
+          <w:color w:val="C01F1F"/>
+        </w:rPr>
+        <w:t>[figure not produced yet: results/figures/shap_summary_beeswarm.png]</w:t>
       </w:r>
     </w:p>
     <w:p>
@@ -3889,8 +4039,11 @@
         <w:t xml:space="preserve">SHAP summary for </w:t>
       </w:r>
       <w:r>
-        <w:rPr/>
-        <w:t>Random forest</w:t>
+        <w:rPr>
+          <w:i w:val="0"/>
+          <w:color w:val="C01F1F"/>
+        </w:rPr>
+        <w:t>[shap.model]</w:t>
       </w:r>
       <w:r>
         <w:rPr/>
@@ -3928,16 +4081,22 @@
         <w:t xml:space="preserve">For the review-text model, the n-grams most associated with unverified apps included </w:t>
       </w:r>
       <w:r>
-        <w:rPr/>
-        <w:t>“no personal”, “credit card”, “kuhoo”, “smooth app”, “how much”</w:t>
+        <w:rPr>
+          <w:i w:val="0"/>
+          <w:color w:val="C01F1F"/>
+        </w:rPr>
+        <w:t>[text.top_unverified]</w:t>
       </w:r>
       <w:r>
         <w:rPr/>
         <w:t xml:space="preserve">, and those most associated with verified apps included </w:t>
       </w:r>
       <w:r>
-        <w:rPr/>
-        <w:t>“instant loan”, “fast loan”, “good working”, “10”, “super fast”</w:t>
+        <w:rPr>
+          <w:i w:val="0"/>
+          <w:color w:val="C01F1F"/>
+        </w:rPr>
+        <w:t>[text.top_verified]</w:t>
       </w:r>
       <w:r>
         <w:rPr/>
@@ -3958,38 +4117,11 @@
         <w:jc w:val="center"/>
       </w:pPr>
       <w:r>
-        <w:drawing>
-          <wp:inline xmlns:a="http://schemas.openxmlformats.org/drawingml/2006/main" xmlns:pic="http://schemas.openxmlformats.org/drawingml/2006/picture">
-            <wp:extent cx="4031999" cy="3684474"/>
-            <wp:docPr id="5" name="Picture 5"/>
-            <wp:cNvGraphicFramePr>
-              <a:graphicFrameLocks noChangeAspect="1"/>
-            </wp:cNvGraphicFramePr>
-            <a:graphic>
-              <a:graphicData uri="http://schemas.openxmlformats.org/drawingml/2006/picture">
-                <pic:pic>
-                  <pic:nvPicPr>
-                    <pic:cNvPr id="0" name="shap_text_top_terms.png"/>
-                    <pic:cNvPicPr/>
-                  </pic:nvPicPr>
-                  <pic:blipFill>
-                    <a:blip r:embed="rId13"/>
-                    <a:stretch>
-                      <a:fillRect/>
-                    </a:stretch>
-                  </pic:blipFill>
-                  <pic:spPr>
-                    <a:xfrm>
-                      <a:off x="0" y="0"/>
-                      <a:ext cx="4031999" cy="3684474"/>
-                    </a:xfrm>
-                    <a:prstGeom prst="rect"/>
-                  </pic:spPr>
-                </pic:pic>
-              </a:graphicData>
-            </a:graphic>
-          </wp:inline>
-        </w:drawing>
+        <w:rPr>
+          <w:i w:val="0"/>
+          <w:color w:val="C01F1F"/>
+        </w:rPr>
+        <w:t>[figure not produced yet: results/figures/shap_text_top_terms.png]</w:t>
       </w:r>
     </w:p>
     <w:p>

</xml_diff>

<commit_message>
Final results: all experiments, explanations, notebooks and Results docx
- Final run at n_iter=30 on 414 labelled apps (50 unverified); notebooks
  01-03 committed with outputs; MuRIL frozen-embedding OOF scores included
- Organic headline: logistic regression PR-AUC 0.65 +/- 0.04 (base rate
  0.218), fusion with TF-IDF 0.67 +/- 0.06; permissions most informative;
  random splits overstate PR-AUC by 0.04-0.08; early detection 0.62
- results/tables, figures, OOF scores and runs.csv
- shap_report.run() writes the model card (used by notebook 03 too), so the
  report and demo read the final model's details
- Results section filled (144/144) with interpretation written from the
  final numbers; number columns no longer wrap
- Data card and README updated with final counts, results and limitations
</commit_message>
<xml_diff>
--- a/report/results_section.docx
+++ b/report/results_section.docx
@@ -192,7 +192,7 @@
         </w:trPr>
         <w:tc>
           <w:tcPr>
-            <w:tcW w:type="dxa" w:w="5544"/>
+            <w:tcW w:type="dxa" w:w="5325"/>
             <w:tcBorders>
               <w:top w:val="single" w:sz="12" w:space="0" w:color="000000"/>
               <w:bottom w:val="single" w:sz="6" w:space="0" w:color="000000"/>
@@ -208,7 +208,7 @@
         </w:tc>
         <w:tc>
           <w:tcPr>
-            <w:tcW w:type="dxa" w:w="688"/>
+            <w:tcW w:type="dxa" w:w="907"/>
             <w:tcBorders>
               <w:top w:val="single" w:sz="12" w:space="0" w:color="000000"/>
               <w:bottom w:val="single" w:sz="6" w:space="0" w:color="000000"/>
@@ -259,7 +259,7 @@
         </w:trPr>
         <w:tc>
           <w:tcPr>
-            <w:tcW w:type="dxa" w:w="5544"/>
+            <w:tcW w:type="dxa" w:w="5325"/>
           </w:tcPr>
           <w:p>
             <w:pPr>
@@ -277,7 +277,7 @@
         </w:tc>
         <w:tc>
           <w:tcPr>
-            <w:tcW w:type="dxa" w:w="688"/>
+            <w:tcW w:type="dxa" w:w="907"/>
           </w:tcPr>
           <w:p>
             <w:pPr>
@@ -318,7 +318,7 @@
         </w:trPr>
         <w:tc>
           <w:tcPr>
-            <w:tcW w:type="dxa" w:w="5544"/>
+            <w:tcW w:type="dxa" w:w="5325"/>
           </w:tcPr>
           <w:p>
             <w:pPr>
@@ -336,7 +336,7 @@
         </w:tc>
         <w:tc>
           <w:tcPr>
-            <w:tcW w:type="dxa" w:w="688"/>
+            <w:tcW w:type="dxa" w:w="907"/>
           </w:tcPr>
           <w:p>
             <w:pPr>
@@ -377,7 +377,7 @@
         </w:trPr>
         <w:tc>
           <w:tcPr>
-            <w:tcW w:type="dxa" w:w="5544"/>
+            <w:tcW w:type="dxa" w:w="5325"/>
           </w:tcPr>
           <w:p>
             <w:pPr>
@@ -395,7 +395,7 @@
         </w:tc>
         <w:tc>
           <w:tcPr>
-            <w:tcW w:type="dxa" w:w="688"/>
+            <w:tcW w:type="dxa" w:w="907"/>
           </w:tcPr>
           <w:p>
             <w:pPr>
@@ -436,7 +436,7 @@
         </w:trPr>
         <w:tc>
           <w:tcPr>
-            <w:tcW w:type="dxa" w:w="5544"/>
+            <w:tcW w:type="dxa" w:w="5325"/>
           </w:tcPr>
           <w:p>
             <w:pPr>
@@ -454,7 +454,7 @@
         </w:tc>
         <w:tc>
           <w:tcPr>
-            <w:tcW w:type="dxa" w:w="688"/>
+            <w:tcW w:type="dxa" w:w="907"/>
           </w:tcPr>
           <w:p>
             <w:pPr>
@@ -495,7 +495,7 @@
         </w:trPr>
         <w:tc>
           <w:tcPr>
-            <w:tcW w:type="dxa" w:w="5544"/>
+            <w:tcW w:type="dxa" w:w="5325"/>
             <w:tcBorders>
               <w:top w:val="single" w:sz="4" w:space="0" w:color="000000"/>
             </w:tcBorders>
@@ -516,7 +516,7 @@
         </w:tc>
         <w:tc>
           <w:tcPr>
-            <w:tcW w:type="dxa" w:w="688"/>
+            <w:tcW w:type="dxa" w:w="907"/>
             <w:tcBorders>
               <w:top w:val="single" w:sz="4" w:space="0" w:color="000000"/>
             </w:tcBorders>
@@ -557,7 +557,7 @@
         </w:trPr>
         <w:tc>
           <w:tcPr>
-            <w:tcW w:type="dxa" w:w="5544"/>
+            <w:tcW w:type="dxa" w:w="5325"/>
             <w:tcBorders>
               <w:bottom w:val="single" w:sz="12" w:space="0" w:color="000000"/>
             </w:tcBorders>
@@ -578,7 +578,7 @@
         </w:tc>
         <w:tc>
           <w:tcPr>
-            <w:tcW w:type="dxa" w:w="688"/>
+            <w:tcW w:type="dxa" w:w="907"/>
             <w:tcBorders>
               <w:bottom w:val="single" w:sz="12" w:space="0" w:color="000000"/>
             </w:tcBorders>
@@ -777,22 +777,16 @@
         <w:t xml:space="preserve"> show their precision–recall curves and confusion matrices. The best tabular model was </w:t>
       </w:r>
       <w:r>
-        <w:rPr>
-          <w:i w:val="0"/>
-          <w:color w:val="C01F1F"/>
-        </w:rPr>
-        <w:t>[main.best_tabular]</w:t>
+        <w:rPr/>
+        <w:t>Logistic regression</w:t>
       </w:r>
       <w:r>
         <w:rPr/>
         <w:t xml:space="preserve"> and the best text model </w:t>
       </w:r>
       <w:r>
-        <w:rPr>
-          <w:i w:val="0"/>
-          <w:color w:val="C01F1F"/>
-        </w:rPr>
-        <w:t>[main.best_text]</w:t>
+        <w:rPr/>
+        <w:t>TF-IDF + LR</w:t>
       </w:r>
       <w:r>
         <w:rPr/>
@@ -857,7 +851,7 @@
         </w:trPr>
         <w:tc>
           <w:tcPr>
-            <w:tcW w:type="dxa" w:w="969"/>
+            <w:tcW w:type="dxa" w:w="786"/>
             <w:tcBorders>
               <w:top w:val="single" w:sz="12" w:space="0" w:color="000000"/>
               <w:bottom w:val="single" w:sz="6" w:space="0" w:color="000000"/>
@@ -873,7 +867,7 @@
         </w:tc>
         <w:tc>
           <w:tcPr>
-            <w:tcW w:type="dxa" w:w="1976"/>
+            <w:tcW w:type="dxa" w:w="2159"/>
             <w:tcBorders>
               <w:top w:val="single" w:sz="12" w:space="0" w:color="000000"/>
               <w:bottom w:val="single" w:sz="6" w:space="0" w:color="000000"/>
@@ -1039,7 +1033,7 @@
         </w:trPr>
         <w:tc>
           <w:tcPr>
-            <w:tcW w:type="dxa" w:w="969"/>
+            <w:tcW w:type="dxa" w:w="786"/>
           </w:tcPr>
           <w:p>
             <w:pPr>
@@ -1057,7 +1051,7 @@
         </w:tc>
         <w:tc>
           <w:tcPr>
-            <w:tcW w:type="dxa" w:w="1976"/>
+            <w:tcW w:type="dxa" w:w="2159"/>
           </w:tcPr>
           <w:p>
             <w:pPr>
@@ -1085,11 +1079,9 @@
             </w:pPr>
             <w:r>
               <w:rPr>
-                <w:i w:val="0"/>
-                <w:color w:val="C01F1F"/>
                 <w:sz w:val="16"/>
               </w:rPr>
-              <w:t>[TBD]</w:t>
+              <w:t>0.65 ± 0.04</w:t>
             </w:r>
           </w:p>
         </w:tc>
@@ -1105,11 +1097,9 @@
             </w:pPr>
             <w:r>
               <w:rPr>
-                <w:i w:val="0"/>
-                <w:color w:val="C01F1F"/>
                 <w:sz w:val="16"/>
               </w:rPr>
-              <w:t>[TBD]</w:t>
+              <w:t>0.85 ± 0.03</w:t>
             </w:r>
           </w:p>
         </w:tc>
@@ -1125,11 +1115,9 @@
             </w:pPr>
             <w:r>
               <w:rPr>
-                <w:i w:val="0"/>
-                <w:color w:val="C01F1F"/>
                 <w:sz w:val="16"/>
               </w:rPr>
-              <w:t>[TBD]</w:t>
+              <w:t>0.40 ± 0.22</w:t>
             </w:r>
           </w:p>
         </w:tc>
@@ -1145,11 +1133,9 @@
             </w:pPr>
             <w:r>
               <w:rPr>
-                <w:i w:val="0"/>
-                <w:color w:val="C01F1F"/>
                 <w:sz w:val="16"/>
               </w:rPr>
-              <w:t>[TBD]</w:t>
+              <w:t>0.45 ± 0.15</w:t>
             </w:r>
           </w:p>
         </w:tc>
@@ -1165,11 +1151,9 @@
             </w:pPr>
             <w:r>
               <w:rPr>
-                <w:i w:val="0"/>
-                <w:color w:val="C01F1F"/>
                 <w:sz w:val="16"/>
               </w:rPr>
-              <w:t>[TBD]</w:t>
+              <w:t>0.52 ± 0.22</w:t>
             </w:r>
           </w:p>
         </w:tc>
@@ -1185,11 +1169,9 @@
             </w:pPr>
             <w:r>
               <w:rPr>
-                <w:i w:val="0"/>
-                <w:color w:val="C01F1F"/>
                 <w:sz w:val="16"/>
               </w:rPr>
-              <w:t>[TBD]</w:t>
+              <w:t>0.42 ± 0.12</w:t>
             </w:r>
           </w:p>
         </w:tc>
@@ -1200,7 +1182,7 @@
         </w:trPr>
         <w:tc>
           <w:tcPr>
-            <w:tcW w:type="dxa" w:w="969"/>
+            <w:tcW w:type="dxa" w:w="786"/>
           </w:tcPr>
           <w:p>
             <w:pPr>
@@ -1212,7 +1194,7 @@
         </w:tc>
         <w:tc>
           <w:tcPr>
-            <w:tcW w:type="dxa" w:w="1976"/>
+            <w:tcW w:type="dxa" w:w="2159"/>
           </w:tcPr>
           <w:p>
             <w:pPr>
@@ -1240,11 +1222,9 @@
             </w:pPr>
             <w:r>
               <w:rPr>
-                <w:i w:val="0"/>
-                <w:color w:val="C01F1F"/>
                 <w:sz w:val="16"/>
               </w:rPr>
-              <w:t>[TBD]</w:t>
+              <w:t>0.58 ± 0.06</w:t>
             </w:r>
           </w:p>
         </w:tc>
@@ -1260,11 +1240,9 @@
             </w:pPr>
             <w:r>
               <w:rPr>
-                <w:i w:val="0"/>
-                <w:color w:val="C01F1F"/>
                 <w:sz w:val="16"/>
               </w:rPr>
-              <w:t>[TBD]</w:t>
+              <w:t>0.80 ± 0.07</w:t>
             </w:r>
           </w:p>
         </w:tc>
@@ -1280,11 +1258,9 @@
             </w:pPr>
             <w:r>
               <w:rPr>
-                <w:i w:val="0"/>
-                <w:color w:val="C01F1F"/>
                 <w:sz w:val="16"/>
               </w:rPr>
-              <w:t>[TBD]</w:t>
+              <w:t>0.34 ± 0.05</w:t>
             </w:r>
           </w:p>
         </w:tc>
@@ -1300,11 +1276,9 @@
             </w:pPr>
             <w:r>
               <w:rPr>
-                <w:i w:val="0"/>
-                <w:color w:val="C01F1F"/>
                 <w:sz w:val="16"/>
               </w:rPr>
-              <w:t>[TBD]</w:t>
+              <w:t>0.54 ± 0.13</w:t>
             </w:r>
           </w:p>
         </w:tc>
@@ -1320,11 +1294,9 @@
             </w:pPr>
             <w:r>
               <w:rPr>
-                <w:i w:val="0"/>
-                <w:color w:val="C01F1F"/>
                 <w:sz w:val="16"/>
               </w:rPr>
-              <w:t>[TBD]</w:t>
+              <w:t>0.54 ± 0.23</w:t>
             </w:r>
           </w:p>
         </w:tc>
@@ -1340,11 +1312,9 @@
             </w:pPr>
             <w:r>
               <w:rPr>
-                <w:i w:val="0"/>
-                <w:color w:val="C01F1F"/>
                 <w:sz w:val="16"/>
               </w:rPr>
-              <w:t>[TBD]</w:t>
+              <w:t>0.34 ± 0.08</w:t>
             </w:r>
           </w:p>
         </w:tc>
@@ -1355,7 +1325,7 @@
         </w:trPr>
         <w:tc>
           <w:tcPr>
-            <w:tcW w:type="dxa" w:w="969"/>
+            <w:tcW w:type="dxa" w:w="786"/>
           </w:tcPr>
           <w:p>
             <w:pPr>
@@ -1367,7 +1337,7 @@
         </w:tc>
         <w:tc>
           <w:tcPr>
-            <w:tcW w:type="dxa" w:w="1976"/>
+            <w:tcW w:type="dxa" w:w="2159"/>
           </w:tcPr>
           <w:p>
             <w:pPr>
@@ -1395,11 +1365,9 @@
             </w:pPr>
             <w:r>
               <w:rPr>
-                <w:i w:val="0"/>
-                <w:color w:val="C01F1F"/>
                 <w:sz w:val="16"/>
               </w:rPr>
-              <w:t>[TBD]</w:t>
+              <w:t>0.55 ± 0.10</w:t>
             </w:r>
           </w:p>
         </w:tc>
@@ -1415,11 +1383,9 @@
             </w:pPr>
             <w:r>
               <w:rPr>
-                <w:i w:val="0"/>
-                <w:color w:val="C01F1F"/>
                 <w:sz w:val="16"/>
               </w:rPr>
-              <w:t>[TBD]</w:t>
+              <w:t>0.79 ± 0.08</w:t>
             </w:r>
           </w:p>
         </w:tc>
@@ -1435,11 +1401,9 @@
             </w:pPr>
             <w:r>
               <w:rPr>
-                <w:i w:val="0"/>
-                <w:color w:val="C01F1F"/>
                 <w:sz w:val="16"/>
               </w:rPr>
-              <w:t>[TBD]</w:t>
+              <w:t>0.42 ± 0.16</w:t>
             </w:r>
           </w:p>
         </w:tc>
@@ -1455,11 +1419,9 @@
             </w:pPr>
             <w:r>
               <w:rPr>
-                <w:i w:val="0"/>
-                <w:color w:val="C01F1F"/>
                 <w:sz w:val="16"/>
               </w:rPr>
-              <w:t>[TBD]</w:t>
+              <w:t>0.54 ± 0.18</w:t>
             </w:r>
           </w:p>
         </w:tc>
@@ -1475,11 +1437,9 @@
             </w:pPr>
             <w:r>
               <w:rPr>
-                <w:i w:val="0"/>
-                <w:color w:val="C01F1F"/>
                 <w:sz w:val="16"/>
               </w:rPr>
-              <w:t>[TBD]</w:t>
+              <w:t>0.48 ± 0.31</w:t>
             </w:r>
           </w:p>
         </w:tc>
@@ -1495,11 +1455,9 @@
             </w:pPr>
             <w:r>
               <w:rPr>
-                <w:i w:val="0"/>
-                <w:color w:val="C01F1F"/>
                 <w:sz w:val="16"/>
               </w:rPr>
-              <w:t>[TBD]</w:t>
+              <w:t>0.34 ± 0.08</w:t>
             </w:r>
           </w:p>
         </w:tc>
@@ -1510,7 +1468,7 @@
         </w:trPr>
         <w:tc>
           <w:tcPr>
-            <w:tcW w:type="dxa" w:w="969"/>
+            <w:tcW w:type="dxa" w:w="786"/>
           </w:tcPr>
           <w:p>
             <w:pPr>
@@ -1522,7 +1480,7 @@
         </w:tc>
         <w:tc>
           <w:tcPr>
-            <w:tcW w:type="dxa" w:w="1976"/>
+            <w:tcW w:type="dxa" w:w="2159"/>
           </w:tcPr>
           <w:p>
             <w:pPr>
@@ -1550,11 +1508,9 @@
             </w:pPr>
             <w:r>
               <w:rPr>
-                <w:i w:val="0"/>
-                <w:color w:val="C01F1F"/>
                 <w:sz w:val="16"/>
               </w:rPr>
-              <w:t>[TBD]</w:t>
+              <w:t>0.57 ± 0.08</w:t>
             </w:r>
           </w:p>
         </w:tc>
@@ -1570,11 +1526,9 @@
             </w:pPr>
             <w:r>
               <w:rPr>
-                <w:i w:val="0"/>
-                <w:color w:val="C01F1F"/>
                 <w:sz w:val="16"/>
               </w:rPr>
-              <w:t>[TBD]</w:t>
+              <w:t>0.78 ± 0.08</w:t>
             </w:r>
           </w:p>
         </w:tc>
@@ -1590,11 +1544,9 @@
             </w:pPr>
             <w:r>
               <w:rPr>
-                <w:i w:val="0"/>
-                <w:color w:val="C01F1F"/>
                 <w:sz w:val="16"/>
               </w:rPr>
-              <w:t>[TBD]</w:t>
+              <w:t>0.36 ± 0.13</w:t>
             </w:r>
           </w:p>
         </w:tc>
@@ -1610,11 +1562,9 @@
             </w:pPr>
             <w:r>
               <w:rPr>
-                <w:i w:val="0"/>
-                <w:color w:val="C01F1F"/>
                 <w:sz w:val="16"/>
               </w:rPr>
-              <w:t>[TBD]</w:t>
+              <w:t>0.48 ± 0.18</w:t>
             </w:r>
           </w:p>
         </w:tc>
@@ -1630,11 +1580,9 @@
             </w:pPr>
             <w:r>
               <w:rPr>
-                <w:i w:val="0"/>
-                <w:color w:val="C01F1F"/>
                 <w:sz w:val="16"/>
               </w:rPr>
-              <w:t>[TBD]</w:t>
+              <w:t>0.62 ± 0.33</w:t>
             </w:r>
           </w:p>
         </w:tc>
@@ -1650,11 +1598,9 @@
             </w:pPr>
             <w:r>
               <w:rPr>
-                <w:i w:val="0"/>
-                <w:color w:val="C01F1F"/>
                 <w:sz w:val="16"/>
               </w:rPr>
-              <w:t>[TBD]</w:t>
+              <w:t>0.37 ± 0.14</w:t>
             </w:r>
           </w:p>
         </w:tc>
@@ -1665,7 +1611,7 @@
         </w:trPr>
         <w:tc>
           <w:tcPr>
-            <w:tcW w:type="dxa" w:w="969"/>
+            <w:tcW w:type="dxa" w:w="786"/>
             <w:tcBorders>
               <w:top w:val="single" w:sz="4" w:space="0" w:color="000000"/>
             </w:tcBorders>
@@ -1686,7 +1632,7 @@
         </w:tc>
         <w:tc>
           <w:tcPr>
-            <w:tcW w:type="dxa" w:w="1976"/>
+            <w:tcW w:type="dxa" w:w="2159"/>
             <w:tcBorders>
               <w:top w:val="single" w:sz="4" w:space="0" w:color="000000"/>
             </w:tcBorders>
@@ -1720,11 +1666,9 @@
             </w:pPr>
             <w:r>
               <w:rPr>
-                <w:i w:val="0"/>
-                <w:color w:val="C01F1F"/>
                 <w:sz w:val="16"/>
               </w:rPr>
-              <w:t>[TBD]</w:t>
+              <w:t>0.49 ± 0.19</w:t>
             </w:r>
           </w:p>
         </w:tc>
@@ -1743,11 +1687,9 @@
             </w:pPr>
             <w:r>
               <w:rPr>
-                <w:i w:val="0"/>
-                <w:color w:val="C01F1F"/>
                 <w:sz w:val="16"/>
               </w:rPr>
-              <w:t>[TBD]</w:t>
+              <w:t>0.66 ± 0.18</w:t>
             </w:r>
           </w:p>
         </w:tc>
@@ -1766,11 +1708,9 @@
             </w:pPr>
             <w:r>
               <w:rPr>
-                <w:i w:val="0"/>
-                <w:color w:val="C01F1F"/>
                 <w:sz w:val="16"/>
               </w:rPr>
-              <w:t>[TBD]</w:t>
+              <w:t>0.29 ± 0.17</w:t>
             </w:r>
           </w:p>
         </w:tc>
@@ -1789,11 +1729,9 @@
             </w:pPr>
             <w:r>
               <w:rPr>
-                <w:i w:val="0"/>
-                <w:color w:val="C01F1F"/>
                 <w:sz w:val="16"/>
               </w:rPr>
-              <w:t>[TBD]</w:t>
+              <w:t>0.34 ± 0.12</w:t>
             </w:r>
           </w:p>
         </w:tc>
@@ -1812,11 +1750,9 @@
             </w:pPr>
             <w:r>
               <w:rPr>
-                <w:i w:val="0"/>
-                <w:color w:val="C01F1F"/>
                 <w:sz w:val="16"/>
               </w:rPr>
-              <w:t>[TBD]</w:t>
+              <w:t>0.46 ± 0.28</w:t>
             </w:r>
           </w:p>
         </w:tc>
@@ -1835,11 +1771,9 @@
             </w:pPr>
             <w:r>
               <w:rPr>
-                <w:i w:val="0"/>
-                <w:color w:val="C01F1F"/>
                 <w:sz w:val="16"/>
               </w:rPr>
-              <w:t>[TBD]</w:t>
+              <w:t>0.32 ± 0.13</w:t>
             </w:r>
           </w:p>
         </w:tc>
@@ -1850,7 +1784,7 @@
         </w:trPr>
         <w:tc>
           <w:tcPr>
-            <w:tcW w:type="dxa" w:w="969"/>
+            <w:tcW w:type="dxa" w:w="786"/>
           </w:tcPr>
           <w:p>
             <w:pPr>
@@ -1862,7 +1796,7 @@
         </w:tc>
         <w:tc>
           <w:tcPr>
-            <w:tcW w:type="dxa" w:w="1976"/>
+            <w:tcW w:type="dxa" w:w="2159"/>
           </w:tcPr>
           <w:p>
             <w:pPr>
@@ -1890,11 +1824,9 @@
             </w:pPr>
             <w:r>
               <w:rPr>
-                <w:i w:val="0"/>
-                <w:color w:val="C01F1F"/>
                 <w:sz w:val="16"/>
               </w:rPr>
-              <w:t>[TBD]</w:t>
+              <w:t>0.48 ± 0.18</w:t>
             </w:r>
           </w:p>
         </w:tc>
@@ -1910,11 +1842,9 @@
             </w:pPr>
             <w:r>
               <w:rPr>
-                <w:i w:val="0"/>
-                <w:color w:val="C01F1F"/>
                 <w:sz w:val="16"/>
               </w:rPr>
-              <w:t>[TBD]</w:t>
+              <w:t>0.67 ± 0.17</w:t>
             </w:r>
           </w:p>
         </w:tc>
@@ -1930,11 +1860,9 @@
             </w:pPr>
             <w:r>
               <w:rPr>
-                <w:i w:val="0"/>
-                <w:color w:val="C01F1F"/>
                 <w:sz w:val="16"/>
               </w:rPr>
-              <w:t>[TBD]</w:t>
+              <w:t>0.27 ± 0.15</w:t>
             </w:r>
           </w:p>
         </w:tc>
@@ -1950,11 +1878,9 @@
             </w:pPr>
             <w:r>
               <w:rPr>
-                <w:i w:val="0"/>
-                <w:color w:val="C01F1F"/>
                 <w:sz w:val="16"/>
               </w:rPr>
-              <w:t>[TBD]</w:t>
+              <w:t>0.40 ± 0.10</w:t>
             </w:r>
           </w:p>
         </w:tc>
@@ -1970,11 +1896,9 @@
             </w:pPr>
             <w:r>
               <w:rPr>
-                <w:i w:val="0"/>
-                <w:color w:val="C01F1F"/>
                 <w:sz w:val="16"/>
               </w:rPr>
-              <w:t>[TBD]</w:t>
+              <w:t>0.44 ± 0.24</w:t>
             </w:r>
           </w:p>
         </w:tc>
@@ -1990,11 +1914,9 @@
             </w:pPr>
             <w:r>
               <w:rPr>
-                <w:i w:val="0"/>
-                <w:color w:val="C01F1F"/>
                 <w:sz w:val="16"/>
               </w:rPr>
-              <w:t>[TBD]</w:t>
+              <w:t>0.32 ± 0.11</w:t>
             </w:r>
           </w:p>
         </w:tc>
@@ -2005,7 +1927,7 @@
         </w:trPr>
         <w:tc>
           <w:tcPr>
-            <w:tcW w:type="dxa" w:w="969"/>
+            <w:tcW w:type="dxa" w:w="786"/>
           </w:tcPr>
           <w:p>
             <w:pPr>
@@ -2017,7 +1939,7 @@
         </w:tc>
         <w:tc>
           <w:tcPr>
-            <w:tcW w:type="dxa" w:w="1976"/>
+            <w:tcW w:type="dxa" w:w="2159"/>
           </w:tcPr>
           <w:p>
             <w:pPr>
@@ -2045,11 +1967,9 @@
             </w:pPr>
             <w:r>
               <w:rPr>
-                <w:i w:val="0"/>
-                <w:color w:val="C01F1F"/>
                 <w:sz w:val="16"/>
               </w:rPr>
-              <w:t>[TBD]</w:t>
+              <w:t>0.26 ± 0.15</w:t>
             </w:r>
           </w:p>
         </w:tc>
@@ -2065,11 +1985,9 @@
             </w:pPr>
             <w:r>
               <w:rPr>
-                <w:i w:val="0"/>
-                <w:color w:val="C01F1F"/>
                 <w:sz w:val="16"/>
               </w:rPr>
-              <w:t>[TBD]</w:t>
+              <w:t>0.49 ± 0.14</w:t>
             </w:r>
           </w:p>
         </w:tc>
@@ -2085,11 +2003,9 @@
             </w:pPr>
             <w:r>
               <w:rPr>
-                <w:i w:val="0"/>
-                <w:color w:val="C01F1F"/>
                 <w:sz w:val="16"/>
               </w:rPr>
-              <w:t>[TBD]</w:t>
+              <w:t>0.04 ± 0.09</w:t>
             </w:r>
           </w:p>
         </w:tc>
@@ -2105,11 +2021,9 @@
             </w:pPr>
             <w:r>
               <w:rPr>
-                <w:i w:val="0"/>
-                <w:color w:val="C01F1F"/>
                 <w:sz w:val="16"/>
               </w:rPr>
-              <w:t>[TBD]</w:t>
+              <w:t>0.20 ± 0.04</w:t>
             </w:r>
           </w:p>
         </w:tc>
@@ -2125,11 +2039,9 @@
             </w:pPr>
             <w:r>
               <w:rPr>
-                <w:i w:val="0"/>
-                <w:color w:val="C01F1F"/>
                 <w:sz w:val="16"/>
               </w:rPr>
-              <w:t>[TBD]</w:t>
+              <w:t>0.89 ± 0.25</w:t>
             </w:r>
           </w:p>
         </w:tc>
@@ -2145,11 +2057,9 @@
             </w:pPr>
             <w:r>
               <w:rPr>
-                <w:i w:val="0"/>
-                <w:color w:val="C01F1F"/>
                 <w:sz w:val="16"/>
               </w:rPr>
-              <w:t>[TBD]</w:t>
+              <w:t>0.14 ± 0.07</w:t>
             </w:r>
           </w:p>
         </w:tc>
@@ -2160,7 +2070,7 @@
         </w:trPr>
         <w:tc>
           <w:tcPr>
-            <w:tcW w:type="dxa" w:w="969"/>
+            <w:tcW w:type="dxa" w:w="786"/>
             <w:tcBorders>
               <w:top w:val="single" w:sz="4" w:space="0" w:color="000000"/>
               <w:bottom w:val="single" w:sz="12" w:space="0" w:color="000000"/>
@@ -2182,7 +2092,7 @@
         </w:tc>
         <w:tc>
           <w:tcPr>
-            <w:tcW w:type="dxa" w:w="1976"/>
+            <w:tcW w:type="dxa" w:w="2159"/>
             <w:tcBorders>
               <w:top w:val="single" w:sz="4" w:space="0" w:color="000000"/>
               <w:bottom w:val="single" w:sz="12" w:space="0" w:color="000000"/>
@@ -2196,11 +2106,9 @@
             </w:pPr>
             <w:r>
               <w:rPr>
-                <w:i w:val="0"/>
-                <w:color w:val="C01F1F"/>
                 <w:sz w:val="16"/>
               </w:rPr>
-              <w:t>[TBD]</w:t>
+              <w:t>Logistic regression + TF-IDF + LR</w:t>
             </w:r>
           </w:p>
         </w:tc>
@@ -2220,11 +2128,9 @@
             </w:pPr>
             <w:r>
               <w:rPr>
-                <w:i w:val="0"/>
-                <w:color w:val="C01F1F"/>
                 <w:sz w:val="16"/>
               </w:rPr>
-              <w:t>[TBD]</w:t>
+              <w:t>0.67 ± 0.06</w:t>
             </w:r>
           </w:p>
         </w:tc>
@@ -2244,11 +2150,9 @@
             </w:pPr>
             <w:r>
               <w:rPr>
-                <w:i w:val="0"/>
-                <w:color w:val="C01F1F"/>
                 <w:sz w:val="16"/>
               </w:rPr>
-              <w:t>[TBD]</w:t>
+              <w:t>0.85 ± 0.05</w:t>
             </w:r>
           </w:p>
         </w:tc>
@@ -2268,11 +2172,9 @@
             </w:pPr>
             <w:r>
               <w:rPr>
-                <w:i w:val="0"/>
-                <w:color w:val="C01F1F"/>
                 <w:sz w:val="16"/>
               </w:rPr>
-              <w:t>[TBD]</w:t>
+              <w:t>0.36 ± 0.25</w:t>
             </w:r>
           </w:p>
         </w:tc>
@@ -2292,11 +2194,9 @@
             </w:pPr>
             <w:r>
               <w:rPr>
-                <w:i w:val="0"/>
-                <w:color w:val="C01F1F"/>
                 <w:sz w:val="16"/>
               </w:rPr>
-              <w:t>[TBD]</w:t>
+              <w:t>0.45 ± 0.14</w:t>
             </w:r>
           </w:p>
         </w:tc>
@@ -2316,11 +2216,9 @@
             </w:pPr>
             <w:r>
               <w:rPr>
-                <w:i w:val="0"/>
-                <w:color w:val="C01F1F"/>
                 <w:sz w:val="16"/>
               </w:rPr>
-              <w:t>[TBD]</w:t>
+              <w:t>0.48 ± 0.26</w:t>
             </w:r>
           </w:p>
         </w:tc>
@@ -2340,11 +2238,9 @@
             </w:pPr>
             <w:r>
               <w:rPr>
-                <w:i w:val="0"/>
-                <w:color w:val="C01F1F"/>
                 <w:sz w:val="16"/>
               </w:rPr>
-              <w:t>[TBD]</w:t>
+              <w:t>0.40 ± 0.13</w:t>
             </w:r>
           </w:p>
         </w:tc>
@@ -2360,11 +2256,88 @@
         <w:jc w:val="both"/>
       </w:pPr>
       <w:r>
-        <w:rPr>
-          <w:i/>
-          <w:color w:val="C01F1F"/>
-        </w:rPr>
-        <w:t>[AUTHOR: Compare the best model with the logistic-regression baseline and with the base rate; say whether tree models, text models or fusion help, and whether the fold standard deviations make the differences meaningful.]</w:t>
+        <w:rPr/>
+        <w:t xml:space="preserve">Logistic regression was the strongest single model (PR-AUC </w:t>
+      </w:r>
+      <w:r>
+        <w:rPr/>
+        <w:t>0.65 ± 0.04</w:t>
+      </w:r>
+      <w:r>
+        <w:rPr/>
+        <w:t xml:space="preserve">, ROC-AUC </w:t>
+      </w:r>
+      <w:r>
+        <w:rPr/>
+        <w:t>0.85 ± 0.03</w:t>
+      </w:r>
+      <w:r>
+        <w:rPr/>
+        <w:t xml:space="preserve">), roughly three times the organic base rate of </w:t>
+      </w:r>
+      <w:r>
+        <w:rPr/>
+        <w:t>0.218</w:t>
+      </w:r>
+      <w:r>
+        <w:rPr/>
+        <w:t xml:space="preserve">. The tree ensembles did not improve on it (random forest </w:t>
+      </w:r>
+      <w:r>
+        <w:rPr/>
+        <w:t>0.58 ± 0.06</w:t>
+      </w:r>
+      <w:r>
+        <w:rPr/>
+        <w:t xml:space="preserve">, LightGBM </w:t>
+      </w:r>
+      <w:r>
+        <w:rPr/>
+        <w:t>0.57 ± 0.08</w:t>
+      </w:r>
+      <w:r>
+        <w:rPr/>
+        <w:t xml:space="preserve">, XGBoost </w:t>
+      </w:r>
+      <w:r>
+        <w:rPr/>
+        <w:t>0.55 ± 0.10</w:t>
+      </w:r>
+      <w:r>
+        <w:rPr/>
+        <w:t xml:space="preserve">) and varied more across folds: with 50 unverified apps, their extra flexibility does not pay off. The review-text models were weaker (TF-IDF + LR </w:t>
+      </w:r>
+      <w:r>
+        <w:rPr/>
+        <w:t>0.49 ± 0.19</w:t>
+      </w:r>
+      <w:r>
+        <w:rPr/>
+        <w:t xml:space="preserve">). Frozen MuRIL embeddings were no better than chance (ROC-AUC </w:t>
+      </w:r>
+      <w:r>
+        <w:rPr/>
+        <w:t>0.49 ± 0.14</w:t>
+      </w:r>
+      <w:r>
+        <w:rPr/>
+        <w:t>), which indicates that MuRIL needs task fine-tuning rather than off-the-shelf sentence vectors. Stacking logistic regression with the TF-IDF model gave the highest PR-AUC (</w:t>
+      </w:r>
+      <w:r>
+        <w:rPr/>
+        <w:t>0.67 ± 0.06</w:t>
+      </w:r>
+      <w:r>
+        <w:rPr/>
+        <w:t>), but the gain over logistic regression alone is within one fold standard deviation. On all apps, including those found through the RBI directory's links, absolute PR-AUC is lower because the base rate is lower (</w:t>
+      </w:r>
+      <w:r>
+        <w:rPr/>
+        <w:t>0.121</w:t>
+      </w:r>
+      <w:r>
+        <w:rPr/>
+        <w:t>).</w:t>
       </w:r>
     </w:p>
     <w:p>
@@ -2373,11 +2346,38 @@
         <w:jc w:val="center"/>
       </w:pPr>
       <w:r>
-        <w:rPr>
-          <w:i w:val="0"/>
-          <w:color w:val="C01F1F"/>
-        </w:rPr>
-        <w:t>[figure not produced yet: results/figures/pr_curves_grouped.png]</w:t>
+        <w:drawing>
+          <wp:inline xmlns:a="http://schemas.openxmlformats.org/drawingml/2006/main" xmlns:pic="http://schemas.openxmlformats.org/drawingml/2006/picture">
+            <wp:extent cx="3571200" cy="2805943"/>
+            <wp:docPr id="1" name="Picture 1"/>
+            <wp:cNvGraphicFramePr>
+              <a:graphicFrameLocks noChangeAspect="1"/>
+            </wp:cNvGraphicFramePr>
+            <a:graphic>
+              <a:graphicData uri="http://schemas.openxmlformats.org/drawingml/2006/picture">
+                <pic:pic>
+                  <pic:nvPicPr>
+                    <pic:cNvPr id="0" name="pr_curves_grouped.png"/>
+                    <pic:cNvPicPr/>
+                  </pic:nvPicPr>
+                  <pic:blipFill>
+                    <a:blip r:embed="rId9"/>
+                    <a:stretch>
+                      <a:fillRect/>
+                    </a:stretch>
+                  </pic:blipFill>
+                  <pic:spPr>
+                    <a:xfrm>
+                      <a:off x="0" y="0"/>
+                      <a:ext cx="3571200" cy="2805943"/>
+                    </a:xfrm>
+                    <a:prstGeom prst="rect"/>
+                  </pic:spPr>
+                </pic:pic>
+              </a:graphicData>
+            </a:graphic>
+          </wp:inline>
+        </w:drawing>
       </w:r>
     </w:p>
     <w:p>
@@ -2395,7 +2395,15 @@
       </w:r>
       <w:r>
         <w:rPr/>
-        <w:t>Precision–recall curves on organic apps (out-of-fold scores; dashed line = base rate).</w:t>
+        <w:t xml:space="preserve">Precision–recall curves on organic apps (out-of-fold scores pooled across folds, so the legend's average precision differs from the per-fold means in </w:t>
+      </w:r>
+      <w:r>
+        <w:rPr/>
+        <w:t>Table 2</w:t>
+      </w:r>
+      <w:r>
+        <w:rPr/>
+        <w:t>; dashed line = base rate).</w:t>
       </w:r>
     </w:p>
     <w:p>
@@ -2404,11 +2412,38 @@
         <w:jc w:val="center"/>
       </w:pPr>
       <w:r>
-        <w:rPr>
-          <w:i w:val="0"/>
-          <w:color w:val="C01F1F"/>
-        </w:rPr>
-        <w:t>[figure not produced yet: results/figures/confusion_grouped.png]</w:t>
+        <w:drawing>
+          <wp:inline xmlns:a="http://schemas.openxmlformats.org/drawingml/2006/main" xmlns:pic="http://schemas.openxmlformats.org/drawingml/2006/picture">
+            <wp:extent cx="5760000" cy="2700000"/>
+            <wp:docPr id="2" name="Picture 2"/>
+            <wp:cNvGraphicFramePr>
+              <a:graphicFrameLocks noChangeAspect="1"/>
+            </wp:cNvGraphicFramePr>
+            <a:graphic>
+              <a:graphicData uri="http://schemas.openxmlformats.org/drawingml/2006/picture">
+                <pic:pic>
+                  <pic:nvPicPr>
+                    <pic:cNvPr id="0" name="confusion_grouped.png"/>
+                    <pic:cNvPicPr/>
+                  </pic:nvPicPr>
+                  <pic:blipFill>
+                    <a:blip r:embed="rId10"/>
+                    <a:stretch>
+                      <a:fillRect/>
+                    </a:stretch>
+                  </pic:blipFill>
+                  <pic:spPr>
+                    <a:xfrm>
+                      <a:off x="0" y="0"/>
+                      <a:ext cx="5760000" cy="2700000"/>
+                    </a:xfrm>
+                    <a:prstGeom prst="rect"/>
+                  </pic:spPr>
+                </pic:pic>
+              </a:graphicData>
+            </a:graphic>
+          </wp:inline>
+        </w:drawing>
       </w:r>
     </w:p>
     <w:p>
@@ -2446,66 +2481,48 @@
         <w:t xml:space="preserve">To test whether models trained on older apps flag newly released ones, we trained on apps released before </w:t>
       </w:r>
       <w:r>
-        <w:rPr>
-          <w:i w:val="0"/>
-          <w:color w:val="C01F1F"/>
-        </w:rPr>
-        <w:t>[temporal.cutoff]</w:t>
+        <w:rPr/>
+        <w:t>2025-11-20</w:t>
       </w:r>
       <w:r>
         <w:rPr/>
         <w:t xml:space="preserve"> (</w:t>
       </w:r>
       <w:r>
-        <w:rPr>
-          <w:i w:val="0"/>
-          <w:color w:val="C01F1F"/>
-        </w:rPr>
-        <w:t>[temporal.n_train]</w:t>
+        <w:rPr/>
+        <w:t>306</w:t>
       </w:r>
       <w:r>
         <w:rPr/>
         <w:t xml:space="preserve"> apps, </w:t>
       </w:r>
       <w:r>
-        <w:rPr>
-          <w:i w:val="0"/>
-          <w:color w:val="C01F1F"/>
-        </w:rPr>
-        <w:t>[temporal.n_train_pos]</w:t>
+        <w:rPr/>
+        <w:t>29</w:t>
       </w:r>
       <w:r>
         <w:rPr/>
         <w:t xml:space="preserve"> unverified) and tested on later releases (</w:t>
       </w:r>
       <w:r>
-        <w:rPr>
-          <w:i w:val="0"/>
-          <w:color w:val="C01F1F"/>
-        </w:rPr>
-        <w:t>[temporal.n_test]</w:t>
+        <w:rPr/>
+        <w:t>43</w:t>
       </w:r>
       <w:r>
         <w:rPr/>
         <w:t xml:space="preserve"> organic apps, </w:t>
       </w:r>
       <w:r>
-        <w:rPr>
-          <w:i w:val="0"/>
-          <w:color w:val="C01F1F"/>
-        </w:rPr>
-        <w:t>[temporal.n_test_pos]</w:t>
+        <w:rPr/>
+        <w:t>21</w:t>
       </w:r>
       <w:r>
         <w:rPr/>
         <w:t xml:space="preserve"> unverified; base rate </w:t>
       </w:r>
       <w:r>
-        <w:rPr>
-          <w:i w:val="0"/>
-          <w:color w:val="C01F1F"/>
-        </w:rPr>
-        <w:t>[temporal.base_rate]</w:t>
+        <w:rPr/>
+        <w:t>0.488</w:t>
       </w:r>
       <w:r>
         <w:rPr/>
@@ -2538,11 +2555,8 @@
         <w:t xml:space="preserve">Temporal hold-out on organic apps released on or after </w:t>
       </w:r>
       <w:r>
-        <w:rPr>
-          <w:i w:val="0"/>
-          <w:color w:val="C01F1F"/>
-        </w:rPr>
-        <w:t>[temporal.cutoff]</w:t>
+        <w:rPr/>
+        <w:t>2025-11-20</w:t>
       </w:r>
       <w:r>
         <w:rPr/>
@@ -2569,7 +2583,7 @@
         </w:trPr>
         <w:tc>
           <w:tcPr>
-            <w:tcW w:type="dxa" w:w="1096"/>
+            <w:tcW w:type="dxa" w:w="6232"/>
             <w:tcBorders>
               <w:top w:val="single" w:sz="12" w:space="0" w:color="000000"/>
               <w:bottom w:val="single" w:sz="6" w:space="0" w:color="000000"/>
@@ -2592,7 +2606,7 @@
         </w:tc>
         <w:tc>
           <w:tcPr>
-            <w:tcW w:type="dxa" w:w="1096"/>
+            <w:tcW w:type="dxa" w:w="907"/>
             <w:tcBorders>
               <w:top w:val="single" w:sz="12" w:space="0" w:color="000000"/>
               <w:bottom w:val="single" w:sz="6" w:space="0" w:color="000000"/>
@@ -2615,7 +2629,7 @@
         </w:tc>
         <w:tc>
           <w:tcPr>
-            <w:tcW w:type="dxa" w:w="1096"/>
+            <w:tcW w:type="dxa" w:w="1024"/>
             <w:tcBorders>
               <w:top w:val="single" w:sz="12" w:space="0" w:color="000000"/>
               <w:bottom w:val="single" w:sz="6" w:space="0" w:color="000000"/>
@@ -2638,7 +2652,7 @@
         </w:tc>
         <w:tc>
           <w:tcPr>
-            <w:tcW w:type="dxa" w:w="1096"/>
+            <w:tcW w:type="dxa" w:w="907"/>
             <w:tcBorders>
               <w:top w:val="single" w:sz="12" w:space="0" w:color="000000"/>
               <w:bottom w:val="single" w:sz="6" w:space="0" w:color="000000"/>
@@ -2666,7 +2680,7 @@
         </w:trPr>
         <w:tc>
           <w:tcPr>
-            <w:tcW w:type="dxa" w:w="1096"/>
+            <w:tcW w:type="dxa" w:w="6232"/>
           </w:tcPr>
           <w:p>
             <w:pPr>
@@ -2676,17 +2690,15 @@
             </w:pPr>
             <w:r>
               <w:rPr>
-                <w:i w:val="0"/>
-                <w:color w:val="C01F1F"/>
                 <w:sz w:val="18"/>
               </w:rPr>
-              <w:t>[TBD]</w:t>
+              <w:t>Logistic regression</w:t>
             </w:r>
           </w:p>
         </w:tc>
         <w:tc>
           <w:tcPr>
-            <w:tcW w:type="dxa" w:w="1096"/>
+            <w:tcW w:type="dxa" w:w="907"/>
           </w:tcPr>
           <w:p>
             <w:pPr>
@@ -2696,17 +2708,15 @@
             </w:pPr>
             <w:r>
               <w:rPr>
-                <w:i w:val="0"/>
-                <w:color w:val="C01F1F"/>
                 <w:sz w:val="18"/>
               </w:rPr>
-              <w:t>[TBD]</w:t>
+              <w:t>0.77</w:t>
             </w:r>
           </w:p>
         </w:tc>
         <w:tc>
           <w:tcPr>
-            <w:tcW w:type="dxa" w:w="1096"/>
+            <w:tcW w:type="dxa" w:w="1024"/>
           </w:tcPr>
           <w:p>
             <w:pPr>
@@ -2716,17 +2726,15 @@
             </w:pPr>
             <w:r>
               <w:rPr>
-                <w:i w:val="0"/>
-                <w:color w:val="C01F1F"/>
                 <w:sz w:val="18"/>
               </w:rPr>
-              <w:t>[TBD]</w:t>
+              <w:t>0.72</w:t>
             </w:r>
           </w:p>
         </w:tc>
         <w:tc>
           <w:tcPr>
-            <w:tcW w:type="dxa" w:w="1096"/>
+            <w:tcW w:type="dxa" w:w="907"/>
           </w:tcPr>
           <w:p>
             <w:pPr>
@@ -2736,11 +2744,9 @@
             </w:pPr>
             <w:r>
               <w:rPr>
-                <w:i w:val="0"/>
-                <w:color w:val="C01F1F"/>
                 <w:sz w:val="18"/>
               </w:rPr>
-              <w:t>[TBD]</w:t>
+              <w:t>0.33</w:t>
             </w:r>
           </w:p>
         </w:tc>
@@ -2751,7 +2757,7 @@
         </w:trPr>
         <w:tc>
           <w:tcPr>
-            <w:tcW w:type="dxa" w:w="1096"/>
+            <w:tcW w:type="dxa" w:w="6232"/>
           </w:tcPr>
           <w:p>
             <w:pPr>
@@ -2761,17 +2767,15 @@
             </w:pPr>
             <w:r>
               <w:rPr>
-                <w:i w:val="0"/>
-                <w:color w:val="C01F1F"/>
                 <w:sz w:val="18"/>
               </w:rPr>
-              <w:t>[TBD]</w:t>
+              <w:t>Random forest</w:t>
             </w:r>
           </w:p>
         </w:tc>
         <w:tc>
           <w:tcPr>
-            <w:tcW w:type="dxa" w:w="1096"/>
+            <w:tcW w:type="dxa" w:w="907"/>
           </w:tcPr>
           <w:p>
             <w:pPr>
@@ -2781,17 +2785,15 @@
             </w:pPr>
             <w:r>
               <w:rPr>
-                <w:i w:val="0"/>
-                <w:color w:val="C01F1F"/>
                 <w:sz w:val="18"/>
               </w:rPr>
-              <w:t>[TBD]</w:t>
+              <w:t>0.87</w:t>
             </w:r>
           </w:p>
         </w:tc>
         <w:tc>
           <w:tcPr>
-            <w:tcW w:type="dxa" w:w="1096"/>
+            <w:tcW w:type="dxa" w:w="1024"/>
           </w:tcPr>
           <w:p>
             <w:pPr>
@@ -2801,17 +2803,15 @@
             </w:pPr>
             <w:r>
               <w:rPr>
-                <w:i w:val="0"/>
-                <w:color w:val="C01F1F"/>
                 <w:sz w:val="18"/>
               </w:rPr>
-              <w:t>[TBD]</w:t>
+              <w:t>0.88</w:t>
             </w:r>
           </w:p>
         </w:tc>
         <w:tc>
           <w:tcPr>
-            <w:tcW w:type="dxa" w:w="1096"/>
+            <w:tcW w:type="dxa" w:w="907"/>
           </w:tcPr>
           <w:p>
             <w:pPr>
@@ -2821,11 +2821,9 @@
             </w:pPr>
             <w:r>
               <w:rPr>
-                <w:i w:val="0"/>
-                <w:color w:val="C01F1F"/>
                 <w:sz w:val="18"/>
               </w:rPr>
-              <w:t>[TBD]</w:t>
+              <w:t>0.67</w:t>
             </w:r>
           </w:p>
         </w:tc>
@@ -2836,7 +2834,7 @@
         </w:trPr>
         <w:tc>
           <w:tcPr>
-            <w:tcW w:type="dxa" w:w="1096"/>
+            <w:tcW w:type="dxa" w:w="6232"/>
             <w:tcBorders>
               <w:bottom w:val="single" w:sz="12" w:space="0" w:color="000000"/>
             </w:tcBorders>
@@ -2849,17 +2847,15 @@
             </w:pPr>
             <w:r>
               <w:rPr>
-                <w:i w:val="0"/>
-                <w:color w:val="C01F1F"/>
                 <w:sz w:val="18"/>
               </w:rPr>
-              <w:t>[TBD]</w:t>
+              <w:t>LightGBM</w:t>
             </w:r>
           </w:p>
         </w:tc>
         <w:tc>
           <w:tcPr>
-            <w:tcW w:type="dxa" w:w="1096"/>
+            <w:tcW w:type="dxa" w:w="907"/>
             <w:tcBorders>
               <w:bottom w:val="single" w:sz="12" w:space="0" w:color="000000"/>
             </w:tcBorders>
@@ -2872,17 +2868,15 @@
             </w:pPr>
             <w:r>
               <w:rPr>
-                <w:i w:val="0"/>
-                <w:color w:val="C01F1F"/>
                 <w:sz w:val="18"/>
               </w:rPr>
-              <w:t>[TBD]</w:t>
+              <w:t>0.74</w:t>
             </w:r>
           </w:p>
         </w:tc>
         <w:tc>
           <w:tcPr>
-            <w:tcW w:type="dxa" w:w="1096"/>
+            <w:tcW w:type="dxa" w:w="1024"/>
             <w:tcBorders>
               <w:bottom w:val="single" w:sz="12" w:space="0" w:color="000000"/>
             </w:tcBorders>
@@ -2895,17 +2889,15 @@
             </w:pPr>
             <w:r>
               <w:rPr>
-                <w:i w:val="0"/>
-                <w:color w:val="C01F1F"/>
                 <w:sz w:val="18"/>
               </w:rPr>
-              <w:t>[TBD]</w:t>
+              <w:t>0.74</w:t>
             </w:r>
           </w:p>
         </w:tc>
         <w:tc>
           <w:tcPr>
-            <w:tcW w:type="dxa" w:w="1096"/>
+            <w:tcW w:type="dxa" w:w="907"/>
             <w:tcBorders>
               <w:bottom w:val="single" w:sz="12" w:space="0" w:color="000000"/>
             </w:tcBorders>
@@ -2918,11 +2910,9 @@
             </w:pPr>
             <w:r>
               <w:rPr>
-                <w:i w:val="0"/>
-                <w:color w:val="C01F1F"/>
                 <w:sz w:val="18"/>
               </w:rPr>
-              <w:t>[TBD]</w:t>
+              <w:t>0.38</w:t>
             </w:r>
           </w:p>
         </w:tc>
@@ -2938,11 +2928,40 @@
         <w:jc w:val="both"/>
       </w:pPr>
       <w:r>
-        <w:rPr>
-          <w:i/>
-          <w:color w:val="C01F1F"/>
-        </w:rPr>
-        <w:t>[AUTHOR: Compare with the grouped-CV results. If performance drops, relate it to the change in the unverified population after the January 2026 Play removal (older and newer unverified apps differ).]</w:t>
+        <w:rPr/>
+        <w:t xml:space="preserve">The random forest ranked later releases well (PR-AUC </w:t>
+      </w:r>
+      <w:r>
+        <w:rPr/>
+        <w:t>0.87</w:t>
+      </w:r>
+      <w:r>
+        <w:rPr/>
+        <w:t xml:space="preserve">, ROC-AUC </w:t>
+      </w:r>
+      <w:r>
+        <w:rPr/>
+        <w:t>0.88</w:t>
+      </w:r>
+      <w:r>
+        <w:rPr/>
+        <w:t xml:space="preserve">), and logistic regression less so (ROC-AUC </w:t>
+      </w:r>
+      <w:r>
+        <w:rPr/>
+        <w:t>0.72</w:t>
+      </w:r>
+      <w:r>
+        <w:rPr/>
+        <w:t xml:space="preserve">). The test period is dominated by unverified apps (base rate </w:t>
+      </w:r>
+      <w:r>
+        <w:rPr/>
+        <w:t>0.488</w:t>
+      </w:r>
+      <w:r>
+        <w:rPr/>
+        <w:t>): most unverified apps still live were released after Google Play's January 2026 removal of unlisted loan apps, so the higher PR-AUC partly reflects the base rate. ROC-AUC, which does not depend on the base rate, is comparable to grouped cross-validation, which suggests the learned signals carry over to newer apps.</w:t>
       </w:r>
     </w:p>
     <w:p>
@@ -2962,77 +2981,56 @@
         <w:t xml:space="preserve">Removing one feature group at a time from </w:t>
       </w:r>
       <w:r>
-        <w:rPr>
-          <w:i w:val="0"/>
-          <w:color w:val="C01F1F"/>
-        </w:rPr>
-        <w:t>[ablation.model]</w:t>
+        <w:rPr/>
+        <w:t>Logistic regression</w:t>
       </w:r>
       <w:r>
         <w:rPr/>
         <w:t xml:space="preserve"> (full model PR-AUC </w:t>
       </w:r>
       <w:r>
-        <w:rPr>
-          <w:i w:val="0"/>
-          <w:color w:val="C01F1F"/>
-        </w:rPr>
-        <w:t>[ablation.full]</w:t>
+        <w:rPr/>
+        <w:t>0.65</w:t>
       </w:r>
       <w:r>
         <w:rPr/>
         <w:t xml:space="preserve">) changed PR-AUC by </w:t>
       </w:r>
       <w:r>
-        <w:rPr>
-          <w:i w:val="0"/>
-          <w:color w:val="C01F1F"/>
-        </w:rPr>
-        <w:t>[ablation.metadata]</w:t>
+        <w:rPr/>
+        <w:t>+0.004</w:t>
       </w:r>
       <w:r>
         <w:rPr/>
         <w:t xml:space="preserve"> (metadata), </w:t>
       </w:r>
       <w:r>
-        <w:rPr>
-          <w:i w:val="0"/>
-          <w:color w:val="C01F1F"/>
-        </w:rPr>
-        <w:t>[ablation.developer]</w:t>
+        <w:rPr/>
+        <w:t>−0.008</w:t>
       </w:r>
       <w:r>
         <w:rPr/>
         <w:t xml:space="preserve"> (developer), </w:t>
       </w:r>
       <w:r>
-        <w:rPr>
-          <w:i w:val="0"/>
-          <w:color w:val="C01F1F"/>
-        </w:rPr>
-        <w:t>[ablation.permissions]</w:t>
+        <w:rPr/>
+        <w:t>−0.080</w:t>
       </w:r>
       <w:r>
         <w:rPr/>
         <w:t xml:space="preserve"> (permissions), </w:t>
       </w:r>
       <w:r>
-        <w:rPr>
-          <w:i w:val="0"/>
-          <w:color w:val="C01F1F"/>
-        </w:rPr>
-        <w:t>[ablation.listing_text]</w:t>
+        <w:rPr/>
+        <w:t>−0.022</w:t>
       </w:r>
       <w:r>
         <w:rPr/>
         <w:t xml:space="preserve"> (listing text) and </w:t>
       </w:r>
       <w:r>
-        <w:rPr>
-          <w:i w:val="0"/>
-          <w:color w:val="C01F1F"/>
-        </w:rPr>
-        <w:t>[ablation.review_text]</w:t>
+        <w:rPr/>
+        <w:t>−0.045</w:t>
       </w:r>
       <w:r>
         <w:rPr/>
@@ -3047,11 +3045,8 @@
         <w:t xml:space="preserve">). The largest drop came from removing </w:t>
       </w:r>
       <w:r>
-        <w:rPr>
-          <w:i w:val="0"/>
-          <w:color w:val="C01F1F"/>
-        </w:rPr>
-        <w:t>[ablation.most_important]</w:t>
+        <w:rPr/>
+        <w:t>permissions</w:t>
       </w:r>
       <w:r>
         <w:rPr/>
@@ -3064,11 +3059,38 @@
         <w:jc w:val="center"/>
       </w:pPr>
       <w:r>
-        <w:rPr>
-          <w:i w:val="0"/>
-          <w:color w:val="C01F1F"/>
-        </w:rPr>
-        <w:t>[figure not produced yet: results/figures/ablation.png]</w:t>
+        <w:drawing>
+          <wp:inline xmlns:a="http://schemas.openxmlformats.org/drawingml/2006/main" xmlns:pic="http://schemas.openxmlformats.org/drawingml/2006/picture">
+            <wp:extent cx="4320000" cy="2221714"/>
+            <wp:docPr id="3" name="Picture 3"/>
+            <wp:cNvGraphicFramePr>
+              <a:graphicFrameLocks noChangeAspect="1"/>
+            </wp:cNvGraphicFramePr>
+            <a:graphic>
+              <a:graphicData uri="http://schemas.openxmlformats.org/drawingml/2006/picture">
+                <pic:pic>
+                  <pic:nvPicPr>
+                    <pic:cNvPr id="0" name="ablation.png"/>
+                    <pic:cNvPicPr/>
+                  </pic:nvPicPr>
+                  <pic:blipFill>
+                    <a:blip r:embed="rId11"/>
+                    <a:stretch>
+                      <a:fillRect/>
+                    </a:stretch>
+                  </pic:blipFill>
+                  <pic:spPr>
+                    <a:xfrm>
+                      <a:off x="0" y="0"/>
+                      <a:ext cx="4320000" cy="2221714"/>
+                    </a:xfrm>
+                    <a:prstGeom prst="rect"/>
+                  </pic:spPr>
+                </pic:pic>
+              </a:graphicData>
+            </a:graphic>
+          </wp:inline>
+        </w:drawing>
       </w:r>
     </w:p>
     <w:p>
@@ -3106,66 +3128,48 @@
         <w:t xml:space="preserve">Using only information available in an app's first 14 days (no install counts, ratings or age, and reviews from the first two weeks only), </w:t>
       </w:r>
       <w:r>
-        <w:rPr>
-          <w:i w:val="0"/>
-          <w:color w:val="C01F1F"/>
-        </w:rPr>
-        <w:t>[early.model]</w:t>
+        <w:rPr/>
+        <w:t>Logistic regression</w:t>
       </w:r>
       <w:r>
         <w:rPr/>
         <w:t xml:space="preserve"> reached a PR-AUC of </w:t>
       </w:r>
       <w:r>
-        <w:rPr>
-          <w:i w:val="0"/>
-          <w:color w:val="C01F1F"/>
-        </w:rPr>
-        <w:t>[early.early14.pr_auc]</w:t>
+        <w:rPr/>
+        <w:t>0.62 ± 0.12</w:t>
       </w:r>
       <w:r>
         <w:rPr/>
         <w:t xml:space="preserve"> (ROC-AUC </w:t>
       </w:r>
       <w:r>
-        <w:rPr>
-          <w:i w:val="0"/>
-          <w:color w:val="C01F1F"/>
-        </w:rPr>
-        <w:t>[early.early14.roc_auc]</w:t>
+        <w:rPr/>
+        <w:t>0.84 ± 0.05</w:t>
       </w:r>
       <w:r>
         <w:rPr/>
         <w:t xml:space="preserve">), against </w:t>
       </w:r>
       <w:r>
-        <w:rPr>
-          <w:i w:val="0"/>
-          <w:color w:val="C01F1F"/>
-        </w:rPr>
-        <w:t>[early.full.pr_auc]</w:t>
+        <w:rPr/>
+        <w:t>0.65 ± 0.04</w:t>
       </w:r>
       <w:r>
         <w:rPr/>
         <w:t xml:space="preserve"> (ROC-AUC </w:t>
       </w:r>
       <w:r>
-        <w:rPr>
-          <w:i w:val="0"/>
-          <w:color w:val="C01F1F"/>
-        </w:rPr>
-        <w:t>[early.full.roc_auc]</w:t>
+        <w:rPr/>
+        <w:t>0.85 ± 0.03</w:t>
       </w:r>
       <w:r>
         <w:rPr/>
         <w:t xml:space="preserve">) with full snapshot features. Only </w:t>
       </w:r>
       <w:r>
-        <w:rPr>
-          <w:i w:val="0"/>
-          <w:color w:val="C01F1F"/>
-        </w:rPr>
-        <w:t>[early.n_with_reviews]</w:t>
+        <w:rPr/>
+        <w:t>33</w:t>
       </w:r>
       <w:r>
         <w:rPr/>
@@ -3177,11 +3181,8 @@
         <w:jc w:val="both"/>
       </w:pPr>
       <w:r>
-        <w:rPr>
-          <w:i/>
-          <w:color w:val="C01F1F"/>
-        </w:rPr>
-        <w:t>[AUTHOR: State whether early detection is practical and which signals carry it.]</w:t>
+        <w:rPr/>
+        <w:t>Early detection is practical. With only first-fortnight information, ranking performance is close to the full model, so the signals that matter (the listing's disclosures and the permission profile) are available at release rather than accumulating with installs and reviews. Because few apps have early reviews, this result says more about listing and permission signals than about early review text.</w:t>
       </w:r>
     </w:p>
     <w:p>
@@ -3245,7 +3246,7 @@
         </w:trPr>
         <w:tc>
           <w:tcPr>
-            <w:tcW w:type="dxa" w:w="3589"/>
+            <w:tcW w:type="dxa" w:w="3778"/>
             <w:tcBorders>
               <w:top w:val="single" w:sz="12" w:space="0" w:color="000000"/>
               <w:bottom w:val="single" w:sz="6" w:space="0" w:color="000000"/>
@@ -3360,7 +3361,7 @@
         </w:tc>
         <w:tc>
           <w:tcPr>
-            <w:tcW w:type="dxa" w:w="1096"/>
+            <w:tcW w:type="dxa" w:w="907"/>
             <w:tcBorders>
               <w:top w:val="single" w:sz="12" w:space="0" w:color="000000"/>
               <w:bottom w:val="single" w:sz="6" w:space="0" w:color="000000"/>
@@ -3388,7 +3389,7 @@
         </w:trPr>
         <w:tc>
           <w:tcPr>
-            <w:tcW w:type="dxa" w:w="3589"/>
+            <w:tcW w:type="dxa" w:w="3778"/>
           </w:tcPr>
           <w:p>
             <w:pPr>
@@ -3416,11 +3417,9 @@
             </w:pPr>
             <w:r>
               <w:rPr>
-                <w:i w:val="0"/>
-                <w:color w:val="C01F1F"/>
                 <w:sz w:val="18"/>
               </w:rPr>
-              <w:t>[TBD]</w:t>
+              <w:t>0.65 ± 0.04</w:t>
             </w:r>
           </w:p>
         </w:tc>
@@ -3436,11 +3435,9 @@
             </w:pPr>
             <w:r>
               <w:rPr>
-                <w:i w:val="0"/>
-                <w:color w:val="C01F1F"/>
                 <w:sz w:val="18"/>
               </w:rPr>
-              <w:t>[TBD]</w:t>
+              <w:t>0.63 ± 0.12</w:t>
             </w:r>
           </w:p>
         </w:tc>
@@ -3456,11 +3453,9 @@
             </w:pPr>
             <w:r>
               <w:rPr>
-                <w:i w:val="0"/>
-                <w:color w:val="C01F1F"/>
                 <w:sz w:val="18"/>
               </w:rPr>
-              <w:t>[TBD]</w:t>
+              <w:t>0.65 ± 0.04</w:t>
             </w:r>
           </w:p>
         </w:tc>
@@ -3476,17 +3471,15 @@
             </w:pPr>
             <w:r>
               <w:rPr>
-                <w:i w:val="0"/>
-                <w:color w:val="C01F1F"/>
                 <w:sz w:val="18"/>
               </w:rPr>
-              <w:t>[TBD]</w:t>
+              <w:t>0.70 ± 0.09</w:t>
             </w:r>
           </w:p>
         </w:tc>
         <w:tc>
           <w:tcPr>
-            <w:tcW w:type="dxa" w:w="1096"/>
+            <w:tcW w:type="dxa" w:w="907"/>
           </w:tcPr>
           <w:p>
             <w:pPr>
@@ -3496,11 +3489,9 @@
             </w:pPr>
             <w:r>
               <w:rPr>
-                <w:i w:val="0"/>
-                <w:color w:val="C01F1F"/>
                 <w:sz w:val="18"/>
               </w:rPr>
-              <w:t>[TBD]</w:t>
+              <w:t>+0.05</w:t>
             </w:r>
           </w:p>
         </w:tc>
@@ -3511,7 +3502,7 @@
         </w:trPr>
         <w:tc>
           <w:tcPr>
-            <w:tcW w:type="dxa" w:w="3589"/>
+            <w:tcW w:type="dxa" w:w="3778"/>
           </w:tcPr>
           <w:p>
             <w:pPr>
@@ -3539,11 +3530,9 @@
             </w:pPr>
             <w:r>
               <w:rPr>
-                <w:i w:val="0"/>
-                <w:color w:val="C01F1F"/>
                 <w:sz w:val="18"/>
               </w:rPr>
-              <w:t>[TBD]</w:t>
+              <w:t>0.58 ± 0.06</w:t>
             </w:r>
           </w:p>
         </w:tc>
@@ -3559,11 +3548,9 @@
             </w:pPr>
             <w:r>
               <w:rPr>
-                <w:i w:val="0"/>
-                <w:color w:val="C01F1F"/>
                 <w:sz w:val="18"/>
               </w:rPr>
-              <w:t>[TBD]</w:t>
+              <w:t>0.65 ± 0.13</w:t>
             </w:r>
           </w:p>
         </w:tc>
@@ -3579,11 +3566,9 @@
             </w:pPr>
             <w:r>
               <w:rPr>
-                <w:i w:val="0"/>
-                <w:color w:val="C01F1F"/>
                 <w:sz w:val="18"/>
               </w:rPr>
-              <w:t>[TBD]</w:t>
+              <w:t>0.58 ± 0.06</w:t>
             </w:r>
           </w:p>
         </w:tc>
@@ -3599,17 +3584,15 @@
             </w:pPr>
             <w:r>
               <w:rPr>
-                <w:i w:val="0"/>
-                <w:color w:val="C01F1F"/>
                 <w:sz w:val="18"/>
               </w:rPr>
-              <w:t>[TBD]</w:t>
+              <w:t>0.66 ± 0.12</w:t>
             </w:r>
           </w:p>
         </w:tc>
         <w:tc>
           <w:tcPr>
-            <w:tcW w:type="dxa" w:w="1096"/>
+            <w:tcW w:type="dxa" w:w="907"/>
           </w:tcPr>
           <w:p>
             <w:pPr>
@@ -3619,11 +3602,9 @@
             </w:pPr>
             <w:r>
               <w:rPr>
-                <w:i w:val="0"/>
-                <w:color w:val="C01F1F"/>
                 <w:sz w:val="18"/>
               </w:rPr>
-              <w:t>[TBD]</w:t>
+              <w:t>+0.08</w:t>
             </w:r>
           </w:p>
         </w:tc>
@@ -3634,7 +3615,7 @@
         </w:trPr>
         <w:tc>
           <w:tcPr>
-            <w:tcW w:type="dxa" w:w="3589"/>
+            <w:tcW w:type="dxa" w:w="3778"/>
           </w:tcPr>
           <w:p>
             <w:pPr>
@@ -3662,11 +3643,9 @@
             </w:pPr>
             <w:r>
               <w:rPr>
-                <w:i w:val="0"/>
-                <w:color w:val="C01F1F"/>
                 <w:sz w:val="18"/>
               </w:rPr>
-              <w:t>[TBD]</w:t>
+              <w:t>0.55 ± 0.10</w:t>
             </w:r>
           </w:p>
         </w:tc>
@@ -3682,11 +3661,9 @@
             </w:pPr>
             <w:r>
               <w:rPr>
-                <w:i w:val="0"/>
-                <w:color w:val="C01F1F"/>
                 <w:sz w:val="18"/>
               </w:rPr>
-              <w:t>[TBD]</w:t>
+              <w:t>0.57 ± 0.13</w:t>
             </w:r>
           </w:p>
         </w:tc>
@@ -3702,11 +3679,9 @@
             </w:pPr>
             <w:r>
               <w:rPr>
-                <w:i w:val="0"/>
-                <w:color w:val="C01F1F"/>
                 <w:sz w:val="18"/>
               </w:rPr>
-              <w:t>[TBD]</w:t>
+              <w:t>0.55 ± 0.10</w:t>
             </w:r>
           </w:p>
         </w:tc>
@@ -3722,17 +3697,15 @@
             </w:pPr>
             <w:r>
               <w:rPr>
-                <w:i w:val="0"/>
-                <w:color w:val="C01F1F"/>
                 <w:sz w:val="18"/>
               </w:rPr>
-              <w:t>[TBD]</w:t>
+              <w:t>0.59 ± 0.13</w:t>
             </w:r>
           </w:p>
         </w:tc>
         <w:tc>
           <w:tcPr>
-            <w:tcW w:type="dxa" w:w="1096"/>
+            <w:tcW w:type="dxa" w:w="907"/>
           </w:tcPr>
           <w:p>
             <w:pPr>
@@ -3742,11 +3715,9 @@
             </w:pPr>
             <w:r>
               <w:rPr>
-                <w:i w:val="0"/>
-                <w:color w:val="C01F1F"/>
                 <w:sz w:val="18"/>
               </w:rPr>
-              <w:t>[TBD]</w:t>
+              <w:t>+0.04</w:t>
             </w:r>
           </w:p>
         </w:tc>
@@ -3757,7 +3728,7 @@
         </w:trPr>
         <w:tc>
           <w:tcPr>
-            <w:tcW w:type="dxa" w:w="3589"/>
+            <w:tcW w:type="dxa" w:w="3778"/>
             <w:tcBorders>
               <w:bottom w:val="single" w:sz="12" w:space="0" w:color="000000"/>
             </w:tcBorders>
@@ -3791,11 +3762,9 @@
             </w:pPr>
             <w:r>
               <w:rPr>
-                <w:i w:val="0"/>
-                <w:color w:val="C01F1F"/>
                 <w:sz w:val="18"/>
               </w:rPr>
-              <w:t>[TBD]</w:t>
+              <w:t>0.57 ± 0.08</w:t>
             </w:r>
           </w:p>
         </w:tc>
@@ -3814,11 +3783,9 @@
             </w:pPr>
             <w:r>
               <w:rPr>
-                <w:i w:val="0"/>
-                <w:color w:val="C01F1F"/>
                 <w:sz w:val="18"/>
               </w:rPr>
-              <w:t>[TBD]</w:t>
+              <w:t>0.57 ± 0.05</w:t>
             </w:r>
           </w:p>
         </w:tc>
@@ -3837,11 +3804,9 @@
             </w:pPr>
             <w:r>
               <w:rPr>
-                <w:i w:val="0"/>
-                <w:color w:val="C01F1F"/>
                 <w:sz w:val="18"/>
               </w:rPr>
-              <w:t>[TBD]</w:t>
+              <w:t>0.57 ± 0.08</w:t>
             </w:r>
           </w:p>
         </w:tc>
@@ -3860,17 +3825,15 @@
             </w:pPr>
             <w:r>
               <w:rPr>
-                <w:i w:val="0"/>
-                <w:color w:val="C01F1F"/>
                 <w:sz w:val="18"/>
               </w:rPr>
-              <w:t>[TBD]</w:t>
+              <w:t>0.64 ± 0.12</w:t>
             </w:r>
           </w:p>
         </w:tc>
         <w:tc>
           <w:tcPr>
-            <w:tcW w:type="dxa" w:w="1096"/>
+            <w:tcW w:type="dxa" w:w="907"/>
             <w:tcBorders>
               <w:bottom w:val="single" w:sz="12" w:space="0" w:color="000000"/>
             </w:tcBorders>
@@ -3883,11 +3846,9 @@
             </w:pPr>
             <w:r>
               <w:rPr>
-                <w:i w:val="0"/>
-                <w:color w:val="C01F1F"/>
                 <w:sz w:val="18"/>
               </w:rPr>
-              <w:t>[TBD]</w:t>
+              <w:t>+0.07</w:t>
             </w:r>
           </w:p>
         </w:tc>
@@ -3903,11 +3864,24 @@
         <w:jc w:val="both"/>
       </w:pPr>
       <w:r>
-        <w:rPr>
-          <w:i/>
-          <w:color w:val="C01F1F"/>
-        </w:rPr>
-        <w:t>[AUTHOR: One sentence on each comparison: does SMOTE help, and how large is the leakage effect?]</w:t>
+        <w:rPr/>
+        <w:t xml:space="preserve">SMOTE did not help consistently: it raised the random forest's PR-AUC but slightly lowered logistic regression's, and all differences are within fold variability, so class weighting is kept. Random splits overstated PR-AUC for every model (gaps from </w:t>
+      </w:r>
+      <w:r>
+        <w:rPr/>
+        <w:t>+0.04</w:t>
+      </w:r>
+      <w:r>
+        <w:rPr/>
+        <w:t xml:space="preserve"> to </w:t>
+      </w:r>
+      <w:r>
+        <w:rPr/>
+        <w:t>+0.08</w:t>
+      </w:r>
+      <w:r>
+        <w:rPr/>
+        <w:t>), confirming that near-identical apps from the same developer inflate naively split evaluations. All other results therefore use developer-grouped folds.</w:t>
       </w:r>
     </w:p>
     <w:p>
@@ -3931,77 +3905,56 @@
         <w:t xml:space="preserve"> shows SHAP values for </w:t>
       </w:r>
       <w:r>
-        <w:rPr>
-          <w:i w:val="0"/>
-          <w:color w:val="C01F1F"/>
-        </w:rPr>
-        <w:t>[shap.model]</w:t>
+        <w:rPr/>
+        <w:t>Random forest</w:t>
       </w:r>
       <w:r>
         <w:rPr/>
         <w:t xml:space="preserve"> fitted on all </w:t>
       </w:r>
       <w:r>
-        <w:rPr>
-          <w:i w:val="0"/>
-          <w:color w:val="C01F1F"/>
-        </w:rPr>
-        <w:t>[shap.n_apps]</w:t>
+        <w:rPr/>
+        <w:t>414</w:t>
       </w:r>
       <w:r>
         <w:rPr/>
         <w:t xml:space="preserve"> labelled apps. The five most influential features were </w:t>
       </w:r>
       <w:r>
-        <w:rPr>
-          <w:i w:val="0"/>
-          <w:color w:val="C01F1F"/>
-        </w:rPr>
-        <w:t>[shap.top1]</w:t>
+        <w:rPr/>
+        <w:t>names a lending partner</w:t>
       </w:r>
       <w:r>
         <w:rPr/>
         <w:t xml:space="preserve">, </w:t>
       </w:r>
       <w:r>
-        <w:rPr>
-          <w:i w:val="0"/>
-          <w:color w:val="C01F1F"/>
-        </w:rPr>
-        <w:t>[shap.top2]</w:t>
+        <w:rPr/>
+        <w:t>app age (days)</w:t>
       </w:r>
       <w:r>
         <w:rPr/>
         <w:t xml:space="preserve">, </w:t>
       </w:r>
       <w:r>
-        <w:rPr>
-          <w:i w:val="0"/>
-          <w:color w:val="C01F1F"/>
-        </w:rPr>
-        <w:t>[shap.top3]</w:t>
+        <w:rPr/>
+        <w:t>states tenure</w:t>
       </w:r>
       <w:r>
         <w:rPr/>
         <w:t xml:space="preserve">, </w:t>
       </w:r>
       <w:r>
-        <w:rPr>
-          <w:i w:val="0"/>
-          <w:color w:val="C01F1F"/>
-        </w:rPr>
-        <w:t>[shap.top4]</w:t>
+        <w:rPr/>
+        <w:t>description length (log)</w:t>
       </w:r>
       <w:r>
         <w:rPr/>
         <w:t xml:space="preserve"> and </w:t>
       </w:r>
       <w:r>
-        <w:rPr>
-          <w:i w:val="0"/>
-          <w:color w:val="C01F1F"/>
-        </w:rPr>
-        <w:t>[shap.top5]</w:t>
+        <w:rPr/>
+        <w:t>review count (log)</w:t>
       </w:r>
       <w:r>
         <w:rPr/>
@@ -4014,11 +3967,38 @@
         <w:jc w:val="center"/>
       </w:pPr>
       <w:r>
-        <w:rPr>
-          <w:i w:val="0"/>
-          <w:color w:val="C01F1F"/>
-        </w:rPr>
-        <w:t>[figure not produced yet: results/figures/shap_summary_beeswarm.png]</w:t>
+        <w:drawing>
+          <wp:inline xmlns:a="http://schemas.openxmlformats.org/drawingml/2006/main" xmlns:pic="http://schemas.openxmlformats.org/drawingml/2006/picture">
+            <wp:extent cx="4031999" cy="3719944"/>
+            <wp:docPr id="4" name="Picture 4"/>
+            <wp:cNvGraphicFramePr>
+              <a:graphicFrameLocks noChangeAspect="1"/>
+            </wp:cNvGraphicFramePr>
+            <a:graphic>
+              <a:graphicData uri="http://schemas.openxmlformats.org/drawingml/2006/picture">
+                <pic:pic>
+                  <pic:nvPicPr>
+                    <pic:cNvPr id="0" name="shap_summary_beeswarm.png"/>
+                    <pic:cNvPicPr/>
+                  </pic:nvPicPr>
+                  <pic:blipFill>
+                    <a:blip r:embed="rId12"/>
+                    <a:stretch>
+                      <a:fillRect/>
+                    </a:stretch>
+                  </pic:blipFill>
+                  <pic:spPr>
+                    <a:xfrm>
+                      <a:off x="0" y="0"/>
+                      <a:ext cx="4031999" cy="3719944"/>
+                    </a:xfrm>
+                    <a:prstGeom prst="rect"/>
+                  </pic:spPr>
+                </pic:pic>
+              </a:graphicData>
+            </a:graphic>
+          </wp:inline>
+        </w:drawing>
       </w:r>
     </w:p>
     <w:p>
@@ -4039,11 +4019,8 @@
         <w:t xml:space="preserve">SHAP summary for </w:t>
       </w:r>
       <w:r>
-        <w:rPr>
-          <w:i w:val="0"/>
-          <w:color w:val="C01F1F"/>
-        </w:rPr>
-        <w:t>[shap.model]</w:t>
+        <w:rPr/>
+        <w:t>Random forest</w:t>
       </w:r>
       <w:r>
         <w:rPr/>
@@ -4065,11 +4042,28 @@
         <w:jc w:val="both"/>
       </w:pPr>
       <w:r>
+        <w:rPr/>
+        <w:t xml:space="preserve">Whether the listing names an NBFC or bank lending partner dominates. Apps that do are pushed strongly toward </w:t>
+      </w:r>
+      <w:r>
         <w:rPr>
           <w:i/>
-          <w:color w:val="C01F1F"/>
         </w:rPr>
-        <w:t>[AUTHOR: Interpret the top features. Expected from EDA: unverified apps less often name an NBFC/bank partner or state the tenure, use free email addresses more often, and are newer; RBI-listed lenders request SMS access more often. Note that app age may partly reflect survivorship after the Play removal.]</w:t>
+        <w:t>verified</w:t>
+      </w:r>
+      <w:r>
+        <w:rPr/>
+        <w:t xml:space="preserve">, consistent with RBI's requirement that digital lending apps disclose the regulated entity they lend for. Stating the loan tenure and the APR act the same way. Newer apps are pushed toward </w:t>
+      </w:r>
+      <w:r>
+        <w:rPr>
+          <w:i/>
+        </w:rPr>
+        <w:t>unverified</w:t>
+      </w:r>
+      <w:r>
+        <w:rPr/>
+        <w:t>, which partly reflects survivorship after the 2026 Play removal rather than an inherent property of risky apps. Larger, more-reviewed apps lean verified. Two signals run against intuition. Requesting microphone access leans verified, as large regulated lenders use it for video KYC. Complaints about hidden fees also lean verified, because complaint volume scales with the user base. Permissions therefore matter through their pattern, not as simple red flags.</w:t>
       </w:r>
     </w:p>
     <w:p>
@@ -4081,22 +4075,16 @@
         <w:t xml:space="preserve">For the review-text model, the n-grams most associated with unverified apps included </w:t>
       </w:r>
       <w:r>
-        <w:rPr>
-          <w:i w:val="0"/>
-          <w:color w:val="C01F1F"/>
-        </w:rPr>
-        <w:t>[text.top_unverified]</w:t>
+        <w:rPr/>
+        <w:t>“no personal”, “kuhoo”, “home loan”, “down payment”, “credit card”</w:t>
       </w:r>
       <w:r>
         <w:rPr/>
         <w:t xml:space="preserve">, and those most associated with verified apps included </w:t>
       </w:r>
       <w:r>
-        <w:rPr>
-          <w:i w:val="0"/>
-          <w:color w:val="C01F1F"/>
-        </w:rPr>
-        <w:t>[text.top_verified]</w:t>
+        <w:rPr/>
+        <w:t>“good working”, “instant loan”, “fast loan”, “loan and”, “loan apps”</w:t>
       </w:r>
       <w:r>
         <w:rPr/>
@@ -4117,11 +4105,38 @@
         <w:jc w:val="center"/>
       </w:pPr>
       <w:r>
-        <w:rPr>
-          <w:i w:val="0"/>
-          <w:color w:val="C01F1F"/>
-        </w:rPr>
-        <w:t>[figure not produced yet: results/figures/shap_text_top_terms.png]</w:t>
+        <w:drawing>
+          <wp:inline xmlns:a="http://schemas.openxmlformats.org/drawingml/2006/main" xmlns:pic="http://schemas.openxmlformats.org/drawingml/2006/picture">
+            <wp:extent cx="4031999" cy="3747090"/>
+            <wp:docPr id="5" name="Picture 5"/>
+            <wp:cNvGraphicFramePr>
+              <a:graphicFrameLocks noChangeAspect="1"/>
+            </wp:cNvGraphicFramePr>
+            <a:graphic>
+              <a:graphicData uri="http://schemas.openxmlformats.org/drawingml/2006/picture">
+                <pic:pic>
+                  <pic:nvPicPr>
+                    <pic:cNvPr id="0" name="shap_text_top_terms.png"/>
+                    <pic:cNvPicPr/>
+                  </pic:nvPicPr>
+                  <pic:blipFill>
+                    <a:blip r:embed="rId13"/>
+                    <a:stretch>
+                      <a:fillRect/>
+                    </a:stretch>
+                  </pic:blipFill>
+                  <pic:spPr>
+                    <a:xfrm>
+                      <a:off x="0" y="0"/>
+                      <a:ext cx="4031999" cy="3747090"/>
+                    </a:xfrm>
+                    <a:prstGeom prst="rect"/>
+                  </pic:spPr>
+                </pic:pic>
+              </a:graphicData>
+            </a:graphic>
+          </wp:inline>
+        </w:drawing>
       </w:r>
     </w:p>
     <w:p>
@@ -4147,11 +4162,18 @@
         <w:jc w:val="both"/>
       </w:pPr>
       <w:r>
+        <w:rPr/>
+        <w:t xml:space="preserve">The strongest "unverified" terms are largely product and app names (e.g. "kuhoo", "moneyfy", "home loan", "housing"). This reflects that many unverified apps are unlisted home-finance and education-loan apps of regulated lenders. Generic complaint phrases such as "totally fake" lean </w:t>
+      </w:r>
+      <w:r>
         <w:rPr>
           <w:i/>
-          <w:color w:val="C01F1F"/>
         </w:rPr>
-        <w:t>[AUTHOR: Comment on whether these are risk terms or app/product names (the preliminary run showed app names such as "kuhoo", which means the text model partly memorises apps).]</w:t>
+        <w:t>verified</w:t>
+      </w:r>
+      <w:r>
+        <w:rPr/>
+        <w:t>, because popular listed apps attract more complaints. The text model therefore partly recognises apps and products rather than risk language, which is consistent with its weaker grouped cross-validation performance.</w:t>
       </w:r>
     </w:p>
     <w:p>
@@ -4167,11 +4189,50 @@
         <w:jc w:val="both"/>
       </w:pPr>
       <w:r>
+        <w:rPr/>
+        <w:t xml:space="preserve">On organically discovered apps, logistic regression on listing, permission and review features identifies apps missing from RBI's Digital Lending Apps directory with PR-AUC </w:t>
+      </w:r>
+      <w:r>
+        <w:rPr/>
+        <w:t>0.65 ± 0.04</w:t>
+      </w:r>
+      <w:r>
+        <w:rPr/>
+        <w:t xml:space="preserve"> against a base rate of </w:t>
+      </w:r>
+      <w:r>
+        <w:rPr/>
+        <w:t>0.218</w:t>
+      </w:r>
+      <w:r>
+        <w:rPr/>
+        <w:t xml:space="preserve">, and stacking review text raises this to </w:t>
+      </w:r>
+      <w:r>
+        <w:rPr/>
+        <w:t>0.67 ± 0.06</w:t>
+      </w:r>
+      <w:r>
+        <w:rPr/>
+        <w:t xml:space="preserve">. Performance holds on newer releases and with first-fortnight information, so screening apps at release is feasible. The most informative evidence is whether a listing names its regulated lending partner and states its loan terms, together with its permission profile. </w:t>
+      </w:r>
+      <w:r>
         <w:rPr>
           <w:i/>
-          <w:color w:val="C01F1F"/>
         </w:rPr>
-        <w:t>[AUTHOR: Three or four sentences: best model and its organic PR-AUC versus the base rate; what the temporal and early-detection results say about flagging new apps; the most informative signals; the main caveat (labels mean "not in the RBI list", not "illegal").]</w:t>
+        <w:t>Unverified</w:t>
+      </w:r>
+      <w:r>
+        <w:rPr/>
+        <w:t xml:space="preserve"> here means "not in the RBI directory snapshot of </w:t>
+      </w:r>
+      <w:r>
+        <w:rPr/>
+        <w:t>2026-10-08</w:t>
+      </w:r>
+      <w:r>
+        <w:rPr/>
+        <w:t>", a class that includes unlisted apps of regulated lenders, and the borderline labels come from a single AI-assisted annotator. The model is therefore a screening aid, not a legal determination.</w:t>
       </w:r>
     </w:p>
     <w:sectPr>

</xml_diff>